<commit_message>
Revisar citacoes academicas da atividade de TDN
</commit_message>
<xml_diff>
--- a/TecnologiaDadosNegocios/Aulas/08.21/Material/Atividade_Monitorada_1_Grupo_5.docx
+++ b/TecnologiaDadosNegocios/Aulas/08.21/Material/Atividade_Monitorada_1_Grupo_5.docx
@@ -364,7 +364,7 @@
               <w:rPr>
                 <w:sz w:val="15"/>
               </w:rPr>
-              <w:t>Centralizar clientes, prospects, interações, pedidos e reclamações; criar memória institucional da conta, pipeline e segmentação. Assim, o relacionamento pertence à empresa e continua quando um vendedor sai (Soltani &amp; Navimipour, 2016).</w:t>
+              <w:t>Centralizar clientes, prospects, interações, pedidos e reclamações; criar memória institucional da conta, pipeline e segmentação. Assim, o relacionamento pertence à empresa e continua quando um vendedor sai (Soltani &amp; Jafari Navimipour, 2016).</w:t>
             </w:r>
           </w:p>
         </w:tc>
@@ -533,7 +533,7 @@
     </w:p>
     <w:p>
       <w:r>
-        <w:t>Não recomendamos um ERP completo em formato “big bang” no primeiro ano: o orçamento é limitado, a implantação é longa e exige redesenho de processos, migração e mudança organizacional. Revisões sobre ERP destacam integração, customização, qualidade de dados e gestão da mudança entre as principais preocupações de implantação (Martins &amp; Belfo, 2023). O sistema de faturamento atual pode permanecer temporariamente, integrado ao SCM por API, enquanto se avalia uma evolução modular do ERP.</w:t>
+        <w:t>Não recomendamos um ERP completo em formato “big bang” no primeiro ano: o orçamento é limitado, a implantação é longa e exige redesenho de processos, migração e mudança organizacional. Uma revisão de 126 publicações identifica implementação, integração, participação dos usuários, tomada de decisão e gestão de riscos entre as principais preocupações associadas a ERP (Martins &amp; Belfo, 2023). O sistema de faturamento atual pode permanecer temporariamente, integrado ao SCM por API, enquanto se avalia uma evolução modular do ERP.</w:t>
       </w:r>
     </w:p>
     <w:p>
@@ -1784,7 +1784,7 @@
         <w:rPr>
           <w:sz w:val="14"/>
         </w:rPr>
-        <w:t>Soltani, Z., &amp; Navimipour, N. J. (2016). Customer relationship management mechanisms: A systematic review of the state of the art literature and recommendations for future research. Computers in Human Behavior, 61, 667–688. https://doi.org/10.1016/j.chb.2016.03.008</w:t>
+        <w:t>Soltani, Z., &amp; Jafari Navimipour, N. (2016). Customer relationship management mechanisms: A systematic review of the state of the art literature and recommendations for future research. Computers in Human Behavior, 61, 667–688. https://doi.org/10.1016/j.chb.2016.03.008</w:t>
       </w:r>
     </w:p>
     <w:sectPr>

</xml_diff>

<commit_message>
Simplificar formato da atividade de TDN em Arial 12
</commit_message>
<xml_diff>
--- a/TecnologiaDadosNegocios/Aulas/08.21/Material/Atividade_Monitorada_1_Grupo_5.docx
+++ b/TecnologiaDadosNegocios/Aulas/08.21/Material/Atividade_Monitorada_1_Grupo_5.docx
@@ -4,27 +4,26 @@
   <w:body>
     <w:p>
       <w:pPr>
-        <w:spacing w:after="20"/>
+        <w:spacing w:after="60"/>
         <w:jc w:val="center"/>
       </w:pPr>
       <w:r>
         <w:rPr>
-          <w:rFonts w:ascii="Arial" w:hAnsi="Arial"/>
+          <w:rFonts w:ascii="Arial" w:hAnsi="Arial" w:eastAsia="Arial"/>
           <w:b/>
-          <w:color w:val="1F4E78"/>
-          <w:sz w:val="30"/>
+          <w:sz w:val="24"/>
         </w:rPr>
         <w:t>RELATÓRIO — ATIVIDADE MONITORADA 1</w:t>
       </w:r>
     </w:p>
     <w:p>
       <w:pPr>
-        <w:spacing w:after="80"/>
+        <w:spacing w:after="60"/>
         <w:jc w:val="center"/>
       </w:pPr>
       <w:r>
         <w:rPr>
-          <w:rFonts w:ascii="Arial" w:hAnsi="Arial"/>
+          <w:rFonts w:ascii="Arial" w:hAnsi="Arial" w:eastAsia="Arial"/>
           <w:b/>
           <w:sz w:val="24"/>
         </w:rPr>
@@ -33,1808 +32,639 @@
     </w:p>
     <w:p>
       <w:pPr>
-        <w:spacing w:after="100"/>
+        <w:spacing w:after="60"/>
         <w:jc w:val="center"/>
       </w:pPr>
       <w:r>
         <w:rPr>
-          <w:sz w:val="17"/>
+          <w:rFonts w:ascii="Arial" w:hAnsi="Arial" w:eastAsia="Arial"/>
+          <w:b w:val="0"/>
+          <w:sz w:val="24"/>
         </w:rPr>
-        <w:t>Grupo 5: Arthur Gomes Malucelli • Artur Ferreira Santos Lemos • Caio Pupo Murari • João Paulo de Almeida Bastos Bicudo • Matheus Scigliano Dabbur Moreira</w:t>
+        <w:t>Grupo 5: Arthur Gomes Malucelli; Artur Ferreira Santos Lemos; Caio Pupo Murari; João Paulo de Almeida Bastos Bicudo; Matheus Scigliano Dabbur Moreira.</w:t>
       </w:r>
     </w:p>
     <w:p>
       <w:pPr>
-        <w:pStyle w:val="Section"/>
-        <w:keepNext/>
+        <w:pStyle w:val="PlainHeading"/>
       </w:pPr>
       <w:r>
+        <w:rPr>
+          <w:rFonts w:ascii="Arial" w:hAnsi="Arial" w:eastAsia="Arial"/>
+          <w:sz w:val="24"/>
+        </w:rPr>
         <w:t>a) Diagnóstico</w:t>
       </w:r>
     </w:p>
     <w:p>
       <w:pPr>
-        <w:spacing w:after="60"/>
+        <w:jc w:val="both"/>
       </w:pPr>
       <w:r>
-        <w:t>O problema central não é a ausência de um único software, mas a fragmentação de processos, dados e responsabilidades. A solução deve combinar sistemas especializados, integrados por APIs, com uma fonte confiável de dados e governança comum. O ERP pode sustentar o registro operacional, mas não substitui as funções específicas de SCM, CRM, BI e Gestão do Conhecimento.</w:t>
-      </w:r>
-    </w:p>
-    <w:tbl>
-      <w:tblPr>
-        <w:tblStyle w:val="TableGrid"/>
-        <w:tblW w:type="auto" w:w="0"/>
-        <w:jc w:val="center"/>
-        <w:tblLayout w:type="fixed"/>
-        <w:tblLook w:firstColumn="1" w:firstRow="1" w:lastColumn="0" w:lastRow="0" w:noHBand="0" w:noVBand="1" w:val="04A0"/>
-      </w:tblPr>
-      <w:tblGrid>
-        <w:gridCol w:w="3570"/>
-        <w:gridCol w:w="3570"/>
-        <w:gridCol w:w="3570"/>
-      </w:tblGrid>
-      <w:tr>
-        <w:trPr>
-          <w:tblHeader w:val="true"/>
-        </w:trPr>
-        <w:tc>
-          <w:tcPr>
-            <w:tcW w:type="dxa" w:w="2381"/>
-            <w:shd w:fill="1F4E78"/>
-            <w:vAlign w:val="center"/>
-            <w:tcMar>
-              <w:top w:w="60" w:type="dxa"/>
-              <w:start w:w="70" w:type="dxa"/>
-              <w:bottom w:w="60" w:type="dxa"/>
-              <w:end w:w="70" w:type="dxa"/>
-            </w:tcMar>
-          </w:tcPr>
-          <w:p>
-            <w:pPr>
-              <w:jc w:val="center"/>
-            </w:pPr>
-            <w:r>
-              <w:rPr>
-                <w:b/>
-                <w:color w:val="FFFFFF"/>
-                <w:sz w:val="15"/>
-              </w:rPr>
-              <w:t>Sintoma</w:t>
-            </w:r>
-          </w:p>
-        </w:tc>
-        <w:tc>
-          <w:tcPr>
-            <w:tcW w:type="dxa" w:w="1701"/>
-            <w:shd w:fill="1F4E78"/>
-            <w:vAlign w:val="center"/>
-            <w:tcMar>
-              <w:top w:w="60" w:type="dxa"/>
-              <w:start w:w="70" w:type="dxa"/>
-              <w:bottom w:w="60" w:type="dxa"/>
-              <w:end w:w="70" w:type="dxa"/>
-            </w:tcMar>
-          </w:tcPr>
-          <w:p>
-            <w:pPr>
-              <w:jc w:val="center"/>
-            </w:pPr>
-            <w:r>
-              <w:rPr>
-                <w:b/>
-                <w:color w:val="FFFFFF"/>
-                <w:sz w:val="15"/>
-              </w:rPr>
-              <w:t>Sistema indicado</w:t>
-            </w:r>
-          </w:p>
-        </w:tc>
-        <w:tc>
-          <w:tcPr>
-            <w:tcW w:type="dxa" w:w="6123"/>
-            <w:shd w:fill="1F4E78"/>
-            <w:vAlign w:val="center"/>
-            <w:tcMar>
-              <w:top w:w="60" w:type="dxa"/>
-              <w:start w:w="70" w:type="dxa"/>
-              <w:bottom w:w="60" w:type="dxa"/>
-              <w:end w:w="70" w:type="dxa"/>
-            </w:tcMar>
-          </w:tcPr>
-          <w:p>
-            <w:pPr>
-              <w:jc w:val="center"/>
-            </w:pPr>
-            <w:r>
-              <w:rPr>
-                <w:b/>
-                <w:color w:val="FFFFFF"/>
-                <w:sz w:val="15"/>
-              </w:rPr>
-              <w:t>Como resolve</w:t>
-            </w:r>
-          </w:p>
-        </w:tc>
-      </w:tr>
-      <w:tr>
-        <w:tc>
-          <w:tcPr>
-            <w:tcW w:type="dxa" w:w="2381"/>
-            <w:vAlign w:val="top"/>
-            <w:tcMar>
-              <w:top w:w="60" w:type="dxa"/>
-              <w:start w:w="70" w:type="dxa"/>
-              <w:bottom w:w="60" w:type="dxa"/>
-              <w:end w:w="70" w:type="dxa"/>
-            </w:tcMar>
-          </w:tcPr>
-          <w:p>
-            <w:pPr>
-              <w:spacing w:after="0" w:line="240" w:lineRule="auto"/>
-            </w:pPr>
-            <w:r>
-              <w:rPr>
-                <w:sz w:val="15"/>
-              </w:rPr>
-              <w:t>Estoque em Excel, divergente entre sistema e físico</w:t>
-            </w:r>
-          </w:p>
-        </w:tc>
-        <w:tc>
-          <w:tcPr>
-            <w:tcW w:type="dxa" w:w="1701"/>
-            <w:vAlign w:val="top"/>
-            <w:tcMar>
-              <w:top w:w="60" w:type="dxa"/>
-              <w:start w:w="70" w:type="dxa"/>
-              <w:bottom w:w="60" w:type="dxa"/>
-              <w:end w:w="70" w:type="dxa"/>
-            </w:tcMar>
-          </w:tcPr>
-          <w:p>
-            <w:pPr>
-              <w:spacing w:after="0" w:line="240" w:lineRule="auto"/>
-            </w:pPr>
-            <w:r>
-              <w:rPr>
-                <w:sz w:val="15"/>
-              </w:rPr>
-              <w:t>SCM + módulo de estoque do ERP</w:t>
-            </w:r>
-          </w:p>
-        </w:tc>
-        <w:tc>
-          <w:tcPr>
-            <w:tcW w:type="dxa" w:w="6123"/>
-            <w:vAlign w:val="top"/>
-            <w:tcMar>
-              <w:top w:w="60" w:type="dxa"/>
-              <w:start w:w="70" w:type="dxa"/>
-              <w:bottom w:w="60" w:type="dxa"/>
-              <w:end w:w="70" w:type="dxa"/>
-            </w:tcMar>
-          </w:tcPr>
-          <w:p>
-            <w:pPr>
-              <w:spacing w:after="0" w:line="240" w:lineRule="auto"/>
-            </w:pPr>
-            <w:r>
-              <w:rPr>
-                <w:sz w:val="15"/>
-              </w:rPr>
-              <w:t>Registrar movimentações por fábrica em tempo real; padronizar cadastros de SKU, lotes e validade; manter uma única posição de estoque. O SCM usa essa base para reposição e planejamento.</w:t>
-            </w:r>
-          </w:p>
-        </w:tc>
-      </w:tr>
-      <w:tr>
-        <w:tc>
-          <w:tcPr>
-            <w:tcW w:type="dxa" w:w="2381"/>
-            <w:vAlign w:val="top"/>
-            <w:tcMar>
-              <w:top w:w="60" w:type="dxa"/>
-              <w:start w:w="70" w:type="dxa"/>
-              <w:bottom w:w="60" w:type="dxa"/>
-              <w:end w:w="70" w:type="dxa"/>
-            </w:tcMar>
-          </w:tcPr>
-          <w:p>
-            <w:pPr>
-              <w:spacing w:after="0" w:line="240" w:lineRule="auto"/>
-            </w:pPr>
-            <w:r>
-              <w:rPr>
-                <w:sz w:val="15"/>
-              </w:rPr>
-              <w:t>Rupturas, excesso de perecíveis, perdas e atrasos</w:t>
-            </w:r>
-          </w:p>
-        </w:tc>
-        <w:tc>
-          <w:tcPr>
-            <w:tcW w:type="dxa" w:w="1701"/>
-            <w:vAlign w:val="top"/>
-            <w:tcMar>
-              <w:top w:w="60" w:type="dxa"/>
-              <w:start w:w="70" w:type="dxa"/>
-              <w:bottom w:w="60" w:type="dxa"/>
-              <w:end w:w="70" w:type="dxa"/>
-            </w:tcMar>
-          </w:tcPr>
-          <w:p>
-            <w:pPr>
-              <w:spacing w:after="0" w:line="240" w:lineRule="auto"/>
-            </w:pPr>
-            <w:r>
-              <w:rPr>
-                <w:sz w:val="15"/>
-              </w:rPr>
-              <w:t>SCM</w:t>
-            </w:r>
-          </w:p>
-        </w:tc>
-        <w:tc>
-          <w:tcPr>
-            <w:tcW w:type="dxa" w:w="6123"/>
-            <w:vAlign w:val="top"/>
-            <w:tcMar>
-              <w:top w:w="60" w:type="dxa"/>
-              <w:start w:w="70" w:type="dxa"/>
-              <w:bottom w:w="60" w:type="dxa"/>
-              <w:end w:w="70" w:type="dxa"/>
-            </w:tcMar>
-          </w:tcPr>
-          <w:p>
-            <w:pPr>
-              <w:spacing w:after="0" w:line="240" w:lineRule="auto"/>
-            </w:pPr>
-            <w:r>
-              <w:rPr>
-                <w:sz w:val="15"/>
-              </w:rPr>
-              <w:t>Planejar demanda e abastecimento, definir estoques de segurança, rastrear lotes/validade e coordenar fábricas, centros de distribuição e transporte. A literatura destaca integração e compartilhamento de informação como capacidades centrais do SCM (Kakhki &amp; Gargeya, 2019).</w:t>
-            </w:r>
-          </w:p>
-        </w:tc>
-      </w:tr>
-      <w:tr>
-        <w:tc>
-          <w:tcPr>
-            <w:tcW w:type="dxa" w:w="2381"/>
-            <w:vAlign w:val="top"/>
-            <w:tcMar>
-              <w:top w:w="60" w:type="dxa"/>
-              <w:start w:w="70" w:type="dxa"/>
-              <w:bottom w:w="60" w:type="dxa"/>
-              <w:end w:w="70" w:type="dxa"/>
-            </w:tcMar>
-          </w:tcPr>
-          <w:p>
-            <w:pPr>
-              <w:spacing w:after="0" w:line="240" w:lineRule="auto"/>
-            </w:pPr>
-            <w:r>
-              <w:rPr>
-                <w:sz w:val="15"/>
-              </w:rPr>
-              <w:t>Contatos no caderno/WhatsApp e relacionamento levado por vendedores</w:t>
-            </w:r>
-          </w:p>
-        </w:tc>
-        <w:tc>
-          <w:tcPr>
-            <w:tcW w:type="dxa" w:w="1701"/>
-            <w:vAlign w:val="top"/>
-            <w:tcMar>
-              <w:top w:w="60" w:type="dxa"/>
-              <w:start w:w="70" w:type="dxa"/>
-              <w:bottom w:w="60" w:type="dxa"/>
-              <w:end w:w="70" w:type="dxa"/>
-            </w:tcMar>
-          </w:tcPr>
-          <w:p>
-            <w:pPr>
-              <w:spacing w:after="0" w:line="240" w:lineRule="auto"/>
-            </w:pPr>
-            <w:r>
-              <w:rPr>
-                <w:sz w:val="15"/>
-              </w:rPr>
-              <w:t>CRM</w:t>
-            </w:r>
-          </w:p>
-        </w:tc>
-        <w:tc>
-          <w:tcPr>
-            <w:tcW w:type="dxa" w:w="6123"/>
-            <w:vAlign w:val="top"/>
-            <w:tcMar>
-              <w:top w:w="60" w:type="dxa"/>
-              <w:start w:w="70" w:type="dxa"/>
-              <w:bottom w:w="60" w:type="dxa"/>
-              <w:end w:w="70" w:type="dxa"/>
-            </w:tcMar>
-          </w:tcPr>
-          <w:p>
-            <w:pPr>
-              <w:spacing w:after="0" w:line="240" w:lineRule="auto"/>
-            </w:pPr>
-            <w:r>
-              <w:rPr>
-                <w:sz w:val="15"/>
-              </w:rPr>
-              <w:t>Centralizar clientes, prospects, interações, pedidos e reclamações; criar memória institucional da conta, pipeline e segmentação. Assim, o relacionamento pertence à empresa e continua quando um vendedor sai (Soltani &amp; Jafari Navimipour, 2016).</w:t>
-            </w:r>
-          </w:p>
-        </w:tc>
-      </w:tr>
-      <w:tr>
-        <w:tc>
-          <w:tcPr>
-            <w:tcW w:type="dxa" w:w="2381"/>
-            <w:vAlign w:val="top"/>
-            <w:tcMar>
-              <w:top w:w="60" w:type="dxa"/>
-              <w:start w:w="70" w:type="dxa"/>
-              <w:bottom w:w="60" w:type="dxa"/>
-              <w:end w:w="70" w:type="dxa"/>
-            </w:tcMar>
-          </w:tcPr>
-          <w:p>
-            <w:pPr>
-              <w:spacing w:after="0" w:line="240" w:lineRule="auto"/>
-            </w:pPr>
-            <w:r>
-              <w:rPr>
-                <w:sz w:val="15"/>
-              </w:rPr>
-              <w:t>Relatórios levam dias e apresentam números incompatíveis</w:t>
-            </w:r>
-          </w:p>
-        </w:tc>
-        <w:tc>
-          <w:tcPr>
-            <w:tcW w:type="dxa" w:w="1701"/>
-            <w:vAlign w:val="top"/>
-            <w:tcMar>
-              <w:top w:w="60" w:type="dxa"/>
-              <w:start w:w="70" w:type="dxa"/>
-              <w:bottom w:w="60" w:type="dxa"/>
-              <w:end w:w="70" w:type="dxa"/>
-            </w:tcMar>
-          </w:tcPr>
-          <w:p>
-            <w:pPr>
-              <w:spacing w:after="0" w:line="240" w:lineRule="auto"/>
-            </w:pPr>
-            <w:r>
-              <w:rPr>
-                <w:sz w:val="15"/>
-              </w:rPr>
-              <w:t>BI + governança de dados</w:t>
-            </w:r>
-          </w:p>
-        </w:tc>
-        <w:tc>
-          <w:tcPr>
-            <w:tcW w:type="dxa" w:w="6123"/>
-            <w:vAlign w:val="top"/>
-            <w:tcMar>
-              <w:top w:w="60" w:type="dxa"/>
-              <w:start w:w="70" w:type="dxa"/>
-              <w:bottom w:w="60" w:type="dxa"/>
-              <w:end w:w="70" w:type="dxa"/>
-            </w:tcMar>
-          </w:tcPr>
-          <w:p>
-            <w:pPr>
-              <w:spacing w:after="0" w:line="240" w:lineRule="auto"/>
-            </w:pPr>
-            <w:r>
-              <w:rPr>
-                <w:sz w:val="15"/>
-              </w:rPr>
-              <w:t>Consolidar dados validados em painéis com definições únicas de receita, estoque, perdas e nível de serviço. O BI analisa; não corrige dados ruins na origem. A adoção e o uso efetivo são condições para capturar valor (Ain et al., 2019).</w:t>
-            </w:r>
-          </w:p>
-        </w:tc>
-      </w:tr>
-      <w:tr>
-        <w:tc>
-          <w:tcPr>
-            <w:tcW w:type="dxa" w:w="2381"/>
-            <w:vAlign w:val="top"/>
-            <w:tcMar>
-              <w:top w:w="60" w:type="dxa"/>
-              <w:start w:w="70" w:type="dxa"/>
-              <w:bottom w:w="60" w:type="dxa"/>
-              <w:end w:w="70" w:type="dxa"/>
-            </w:tcMar>
-          </w:tcPr>
-          <w:p>
-            <w:pPr>
-              <w:spacing w:after="0" w:line="240" w:lineRule="auto"/>
-            </w:pPr>
-            <w:r>
-              <w:rPr>
-                <w:sz w:val="15"/>
-              </w:rPr>
-              <w:t>Aposentadoria de gerentes eliminou conhecimento de produção</w:t>
-            </w:r>
-          </w:p>
-        </w:tc>
-        <w:tc>
-          <w:tcPr>
-            <w:tcW w:type="dxa" w:w="1701"/>
-            <w:vAlign w:val="top"/>
-            <w:tcMar>
-              <w:top w:w="60" w:type="dxa"/>
-              <w:start w:w="70" w:type="dxa"/>
-              <w:bottom w:w="60" w:type="dxa"/>
-              <w:end w:w="70" w:type="dxa"/>
-            </w:tcMar>
-          </w:tcPr>
-          <w:p>
-            <w:pPr>
-              <w:spacing w:after="0" w:line="240" w:lineRule="auto"/>
-            </w:pPr>
-            <w:r>
-              <w:rPr>
-                <w:sz w:val="15"/>
-              </w:rPr>
-              <w:t>Gestão do Conhecimento (KMS)</w:t>
-            </w:r>
-          </w:p>
-        </w:tc>
-        <w:tc>
-          <w:tcPr>
-            <w:tcW w:type="dxa" w:w="6123"/>
-            <w:vAlign w:val="top"/>
-            <w:tcMar>
-              <w:top w:w="60" w:type="dxa"/>
-              <w:start w:w="70" w:type="dxa"/>
-              <w:bottom w:w="60" w:type="dxa"/>
-              <w:end w:w="70" w:type="dxa"/>
-            </w:tcMar>
-          </w:tcPr>
-          <w:p>
-            <w:pPr>
-              <w:spacing w:after="0" w:line="240" w:lineRule="auto"/>
-            </w:pPr>
-            <w:r>
-              <w:rPr>
-                <w:sz w:val="15"/>
-              </w:rPr>
-              <w:t>Capturar procedimentos, soluções de falhas e lições aprendidas em base pesquisável, vídeos e checklists; validar conteúdo com especialistas e incorporar atualização à rotina. Engajamento, cultura e apoio gerencial são fatores críticos (Alam et al., 2025).</w:t>
-            </w:r>
-          </w:p>
-        </w:tc>
-      </w:tr>
-    </w:tbl>
-    <w:p>
-      <w:pPr>
-        <w:spacing w:after="0"/>
-      </w:pPr>
-    </w:p>
-    <w:p>
-      <w:pPr>
-        <w:pStyle w:val="Section"/>
-        <w:keepNext/>
-      </w:pPr>
-      <w:r>
-        <w:t>b) Priorização: implementar o SCM primeiro</w:t>
-      </w:r>
-    </w:p>
-    <w:p>
-      <w:r>
-        <w:t>A primeira etapa deve privilegiar Operações e Cadeia de Suprimentos, com um SCM em nuvem focado em estoque, planejamento de demanda, reposição, lotes/validade e logística. Essa escolha ataca os prejuízos mais imediatos do caso: descarte de perecíveis, vendas perdidas por ruptura, atrasos e capital imobilizado. Também cria dados operacionais confiáveis para o BI e reduz o risco de informatizar processos inconsistentes.</w:t>
-      </w:r>
-    </w:p>
-    <w:p>
-      <w:r>
-        <w:t>Não recomendamos um ERP completo em formato “big bang” no primeiro ano: o orçamento é limitado, a implantação é longa e exige redesenho de processos, migração e mudança organizacional. Uma revisão de 126 publicações identifica implementação, integração, participação dos usuários, tomada de decisão e gestão de riscos entre as principais preocupações associadas a ERP (Martins &amp; Belfo, 2023). O sistema de faturamento atual pode permanecer temporariamente, integrado ao SCM por API, enquanto se avalia uma evolução modular do ERP.</w:t>
+        <w:rPr>
+          <w:rFonts w:ascii="Arial" w:hAnsi="Arial" w:eastAsia="Arial"/>
+          <w:sz w:val="24"/>
+        </w:rPr>
+        <w:t>O problema central da Sabor &amp; Cia não é a ausência de um único software, mas a fragmentação de processos, dados e responsabilidades. A solução deve combinar sistemas especializados e integrados, com uma fonte confiável de dados e regras comuns de governança. O ERP pode sustentar o registro operacional, mas não substitui as funções específicas de SCM, CRM, BI e Gestão do Conhecimento.</w:t>
       </w:r>
     </w:p>
     <w:p>
       <w:pPr>
-        <w:pStyle w:val="CompactBullet"/>
+        <w:pStyle w:val="PlainBullet"/>
       </w:pPr>
       <w:r>
-        <w:t>Fase 1 — Preparação (0–2 meses): mapear processos, definir donos dos dados, padronizar SKU/unidades/lotes/validade e realizar contagem física inicial.</w:t>
+        <w:rPr>
+          <w:rFonts w:ascii="Arial" w:hAnsi="Arial" w:eastAsia="Arial"/>
+          <w:b/>
+          <w:sz w:val="24"/>
+        </w:rPr>
+        <w:t xml:space="preserve">• Estoque divergente. </w:t>
+      </w:r>
+      <w:r>
+        <w:rPr>
+          <w:rFonts w:ascii="Arial" w:hAnsi="Arial" w:eastAsia="Arial"/>
+          <w:sz w:val="24"/>
+        </w:rPr>
+        <w:t>A empresa deve utilizar SCM integrado ao módulo de estoque do ERP para registrar movimentações por fábrica em tempo real, padronizar cadastros de produtos, lotes e datas de validade e manter uma posição única de estoque.</w:t>
       </w:r>
     </w:p>
     <w:p>
       <w:pPr>
-        <w:pStyle w:val="CompactBullet"/>
+        <w:pStyle w:val="PlainBullet"/>
       </w:pPr>
       <w:r>
-        <w:t>Fase 2 — Piloto (3–5 meses): implantar em uma fábrica e em um fluxo de distribuição, com integração ao faturamento e operação paralela curta para conferência.</w:t>
+        <w:rPr>
+          <w:rFonts w:ascii="Arial" w:hAnsi="Arial" w:eastAsia="Arial"/>
+          <w:b/>
+          <w:sz w:val="24"/>
+        </w:rPr>
+        <w:t xml:space="preserve">• Rupturas, excesso de perecíveis, perdas e atrasos. </w:t>
+      </w:r>
+      <w:r>
+        <w:rPr>
+          <w:rFonts w:ascii="Arial" w:hAnsi="Arial" w:eastAsia="Arial"/>
+          <w:sz w:val="24"/>
+        </w:rPr>
+        <w:t>O SCM permite planejar demanda e abastecimento, definir estoques de segurança, rastrear lotes e coordenar fábricas, centros de distribuição e transporte. A literatura destaca integração e compartilhamento de informação como capacidades centrais do SCM (Kakhki &amp; Gargeya, 2019).</w:t>
       </w:r>
     </w:p>
     <w:p>
       <w:pPr>
-        <w:pStyle w:val="CompactBullet"/>
+        <w:pStyle w:val="PlainBullet"/>
       </w:pPr>
       <w:r>
-        <w:t>Fase 3 — Expansão (6–10 meses): corrigir falhas do piloto, treinar usuários-chave e ampliar para as outras duas fábricas e logística nacional.</w:t>
+        <w:rPr>
+          <w:rFonts w:ascii="Arial" w:hAnsi="Arial" w:eastAsia="Arial"/>
+          <w:b/>
+          <w:sz w:val="24"/>
+        </w:rPr>
+        <w:t xml:space="preserve">• Relacionamento com clientes disperso. </w:t>
+      </w:r>
+      <w:r>
+        <w:rPr>
+          <w:rFonts w:ascii="Arial" w:hAnsi="Arial" w:eastAsia="Arial"/>
+          <w:sz w:val="24"/>
+        </w:rPr>
+        <w:t>O CRM centraliza clientes, prospects, interações, pedidos e reclamações. Isso cria uma memória institucional das contas e impede que o histórico comercial seja perdido quando um vendedor sai da empresa (Soltani &amp; Jafari Navimipour, 2016).</w:t>
       </w:r>
     </w:p>
     <w:p>
       <w:pPr>
-        <w:pStyle w:val="CompactBullet"/>
+        <w:pStyle w:val="PlainBullet"/>
       </w:pPr>
       <w:r>
-        <w:t>Fase 4 — Consolidação (11–12 meses): ativar painel básico de BI e formalizar rotina de melhoria. CRM e KMS entram na sequência; procedimentos críticos podem começar a ser documentados desde já, com baixo custo.</w:t>
+        <w:rPr>
+          <w:rFonts w:ascii="Arial" w:hAnsi="Arial" w:eastAsia="Arial"/>
+          <w:b/>
+          <w:sz w:val="24"/>
+        </w:rPr>
+        <w:t xml:space="preserve">• Relatórios lentos e incompatíveis. </w:t>
+      </w:r>
+      <w:r>
+        <w:rPr>
+          <w:rFonts w:ascii="Arial" w:hAnsi="Arial" w:eastAsia="Arial"/>
+          <w:sz w:val="24"/>
+        </w:rPr>
+        <w:t>O BI deve consolidar dados validados em painéis com definições únicas de receita, estoque, perdas e nível de serviço. O BI analisa a informação, mas não corrige dados ruins na origem. A adoção e o uso efetivo são necessários para capturar valor (Ain et al., 2019).</w:t>
       </w:r>
     </w:p>
     <w:p>
       <w:pPr>
-        <w:pStyle w:val="Section"/>
-        <w:keepNext/>
+        <w:pStyle w:val="PlainBullet"/>
       </w:pPr>
       <w:r>
-        <w:t>c) Riscos da implementação e respostas</w:t>
+        <w:rPr>
+          <w:rFonts w:ascii="Arial" w:hAnsi="Arial" w:eastAsia="Arial"/>
+          <w:b/>
+          <w:sz w:val="24"/>
+        </w:rPr>
+        <w:t xml:space="preserve">• Perda de conhecimento dos gerentes. </w:t>
       </w:r>
-    </w:p>
-    <w:tbl>
-      <w:tblPr>
-        <w:tblStyle w:val="TableGrid"/>
-        <w:tblW w:type="auto" w:w="0"/>
-        <w:jc w:val="center"/>
-        <w:tblLayout w:type="fixed"/>
-        <w:tblLook w:firstColumn="1" w:firstRow="1" w:lastColumn="0" w:lastRow="0" w:noHBand="0" w:noVBand="1" w:val="04A0"/>
-      </w:tblPr>
-      <w:tblGrid>
-        <w:gridCol w:w="3570"/>
-        <w:gridCol w:w="3570"/>
-        <w:gridCol w:w="3570"/>
-      </w:tblGrid>
-      <w:tr>
-        <w:trPr>
-          <w:tblHeader w:val="true"/>
-        </w:trPr>
-        <w:tc>
-          <w:tcPr>
-            <w:tcW w:type="dxa" w:w="2438"/>
-            <w:shd w:fill="1F4E78"/>
-            <w:vAlign w:val="center"/>
-            <w:tcMar>
-              <w:top w:w="60" w:type="dxa"/>
-              <w:start w:w="70" w:type="dxa"/>
-              <w:bottom w:w="60" w:type="dxa"/>
-              <w:end w:w="70" w:type="dxa"/>
-            </w:tcMar>
-          </w:tcPr>
-          <w:p>
-            <w:pPr>
-              <w:jc w:val="center"/>
-            </w:pPr>
-            <w:r>
-              <w:rPr>
-                <w:b/>
-                <w:color w:val="FFFFFF"/>
-                <w:sz w:val="15"/>
-              </w:rPr>
-              <w:t>Risco</w:t>
-            </w:r>
-          </w:p>
-        </w:tc>
-        <w:tc>
-          <w:tcPr>
-            <w:tcW w:type="dxa" w:w="2891"/>
-            <w:shd w:fill="1F4E78"/>
-            <w:vAlign w:val="center"/>
-            <w:tcMar>
-              <w:top w:w="60" w:type="dxa"/>
-              <w:start w:w="70" w:type="dxa"/>
-              <w:bottom w:w="60" w:type="dxa"/>
-              <w:end w:w="70" w:type="dxa"/>
-            </w:tcMar>
-          </w:tcPr>
-          <w:p>
-            <w:pPr>
-              <w:jc w:val="center"/>
-            </w:pPr>
-            <w:r>
-              <w:rPr>
-                <w:b/>
-                <w:color w:val="FFFFFF"/>
-                <w:sz w:val="15"/>
-              </w:rPr>
-              <w:t>Impacto</w:t>
-            </w:r>
-          </w:p>
-        </w:tc>
-        <w:tc>
-          <w:tcPr>
-            <w:tcW w:type="dxa" w:w="4876"/>
-            <w:shd w:fill="1F4E78"/>
-            <w:vAlign w:val="center"/>
-            <w:tcMar>
-              <w:top w:w="60" w:type="dxa"/>
-              <w:start w:w="70" w:type="dxa"/>
-              <w:bottom w:w="60" w:type="dxa"/>
-              <w:end w:w="70" w:type="dxa"/>
-            </w:tcMar>
-          </w:tcPr>
-          <w:p>
-            <w:pPr>
-              <w:jc w:val="center"/>
-            </w:pPr>
-            <w:r>
-              <w:rPr>
-                <w:b/>
-                <w:color w:val="FFFFFF"/>
-                <w:sz w:val="15"/>
-              </w:rPr>
-              <w:t>Mitigação</w:t>
-            </w:r>
-          </w:p>
-        </w:tc>
-      </w:tr>
-      <w:tr>
-        <w:tc>
-          <w:tcPr>
-            <w:tcW w:type="dxa" w:w="2438"/>
-            <w:vAlign w:val="top"/>
-            <w:tcMar>
-              <w:top w:w="60" w:type="dxa"/>
-              <w:start w:w="70" w:type="dxa"/>
-              <w:bottom w:w="60" w:type="dxa"/>
-              <w:end w:w="70" w:type="dxa"/>
-            </w:tcMar>
-          </w:tcPr>
-          <w:p>
-            <w:pPr>
-              <w:spacing w:after="0" w:line="240" w:lineRule="auto"/>
-            </w:pPr>
-            <w:r>
-              <w:rPr>
-                <w:sz w:val="15"/>
-              </w:rPr>
-              <w:t>Dados incorretos ou incompletos (“garbage in, garbage out”)</w:t>
-            </w:r>
-          </w:p>
-        </w:tc>
-        <w:tc>
-          <w:tcPr>
-            <w:tcW w:type="dxa" w:w="2891"/>
-            <w:vAlign w:val="top"/>
-            <w:tcMar>
-              <w:top w:w="60" w:type="dxa"/>
-              <w:start w:w="70" w:type="dxa"/>
-              <w:bottom w:w="60" w:type="dxa"/>
-              <w:end w:w="70" w:type="dxa"/>
-            </w:tcMar>
-          </w:tcPr>
-          <w:p>
-            <w:pPr>
-              <w:spacing w:after="0" w:line="240" w:lineRule="auto"/>
-            </w:pPr>
-            <w:r>
-              <w:rPr>
-                <w:sz w:val="15"/>
-              </w:rPr>
-              <w:t>Previsões e reposições erradas; o sistema apenas automatiza o erro.</w:t>
-            </w:r>
-          </w:p>
-        </w:tc>
-        <w:tc>
-          <w:tcPr>
-            <w:tcW w:type="dxa" w:w="4876"/>
-            <w:vAlign w:val="top"/>
-            <w:tcMar>
-              <w:top w:w="60" w:type="dxa"/>
-              <w:start w:w="70" w:type="dxa"/>
-              <w:bottom w:w="60" w:type="dxa"/>
-              <w:end w:w="70" w:type="dxa"/>
-            </w:tcMar>
-          </w:tcPr>
-          <w:p>
-            <w:pPr>
-              <w:spacing w:after="0" w:line="240" w:lineRule="auto"/>
-            </w:pPr>
-            <w:r>
-              <w:rPr>
-                <w:sz w:val="15"/>
-              </w:rPr>
-              <w:t>Saneamento de cadastros, contagem física, regras de validação, responsáveis por dados e auditoria mensal.</w:t>
-            </w:r>
-          </w:p>
-        </w:tc>
-      </w:tr>
-      <w:tr>
-        <w:tc>
-          <w:tcPr>
-            <w:tcW w:type="dxa" w:w="2438"/>
-            <w:vAlign w:val="top"/>
-            <w:tcMar>
-              <w:top w:w="60" w:type="dxa"/>
-              <w:start w:w="70" w:type="dxa"/>
-              <w:bottom w:w="60" w:type="dxa"/>
-              <w:end w:w="70" w:type="dxa"/>
-            </w:tcMar>
-          </w:tcPr>
-          <w:p>
-            <w:pPr>
-              <w:spacing w:after="0" w:line="240" w:lineRule="auto"/>
-            </w:pPr>
-            <w:r>
-              <w:rPr>
-                <w:sz w:val="15"/>
-              </w:rPr>
-              <w:t>Resistência dos funcionários e uso paralelo de planilhas</w:t>
-            </w:r>
-          </w:p>
-        </w:tc>
-        <w:tc>
-          <w:tcPr>
-            <w:tcW w:type="dxa" w:w="2891"/>
-            <w:vAlign w:val="top"/>
-            <w:tcMar>
-              <w:top w:w="60" w:type="dxa"/>
-              <w:start w:w="70" w:type="dxa"/>
-              <w:bottom w:w="60" w:type="dxa"/>
-              <w:end w:w="70" w:type="dxa"/>
-            </w:tcMar>
-          </w:tcPr>
-          <w:p>
-            <w:pPr>
-              <w:spacing w:after="0" w:line="240" w:lineRule="auto"/>
-            </w:pPr>
-            <w:r>
-              <w:rPr>
-                <w:sz w:val="15"/>
-              </w:rPr>
-              <w:t>Baixa adoção e retorno à fragmentação anterior.</w:t>
-            </w:r>
-          </w:p>
-        </w:tc>
-        <w:tc>
-          <w:tcPr>
-            <w:tcW w:type="dxa" w:w="4876"/>
-            <w:vAlign w:val="top"/>
-            <w:tcMar>
-              <w:top w:w="60" w:type="dxa"/>
-              <w:start w:w="70" w:type="dxa"/>
-              <w:bottom w:w="60" w:type="dxa"/>
-              <w:end w:w="70" w:type="dxa"/>
-            </w:tcMar>
-          </w:tcPr>
-          <w:p>
-            <w:pPr>
-              <w:spacing w:after="0" w:line="240" w:lineRule="auto"/>
-            </w:pPr>
-            <w:r>
-              <w:rPr>
-                <w:sz w:val="15"/>
-              </w:rPr>
-              <w:t>Envolver usuários-chave no desenho, treinar por função, criar suporte local e medir adesão; descontinuar planilhas após estabilização.</w:t>
-            </w:r>
-          </w:p>
-        </w:tc>
-      </w:tr>
-      <w:tr>
-        <w:tc>
-          <w:tcPr>
-            <w:tcW w:type="dxa" w:w="2438"/>
-            <w:vAlign w:val="top"/>
-            <w:tcMar>
-              <w:top w:w="60" w:type="dxa"/>
-              <w:start w:w="70" w:type="dxa"/>
-              <w:bottom w:w="60" w:type="dxa"/>
-              <w:end w:w="70" w:type="dxa"/>
-            </w:tcMar>
-          </w:tcPr>
-          <w:p>
-            <w:pPr>
-              <w:spacing w:after="0" w:line="240" w:lineRule="auto"/>
-            </w:pPr>
-            <w:r>
-              <w:rPr>
-                <w:sz w:val="15"/>
-              </w:rPr>
-              <w:t>Integração falha com faturamento e sistemas legados</w:t>
-            </w:r>
-          </w:p>
-        </w:tc>
-        <w:tc>
-          <w:tcPr>
-            <w:tcW w:type="dxa" w:w="2891"/>
-            <w:vAlign w:val="top"/>
-            <w:tcMar>
-              <w:top w:w="60" w:type="dxa"/>
-              <w:start w:w="70" w:type="dxa"/>
-              <w:bottom w:w="60" w:type="dxa"/>
-              <w:end w:w="70" w:type="dxa"/>
-            </w:tcMar>
-          </w:tcPr>
-          <w:p>
-            <w:pPr>
-              <w:spacing w:after="0" w:line="240" w:lineRule="auto"/>
-            </w:pPr>
-            <w:r>
-              <w:rPr>
-                <w:sz w:val="15"/>
-              </w:rPr>
-              <w:t>Pedidos duplicados, saldos divergentes e interrupção operacional.</w:t>
-            </w:r>
-          </w:p>
-        </w:tc>
-        <w:tc>
-          <w:tcPr>
-            <w:tcW w:type="dxa" w:w="4876"/>
-            <w:vAlign w:val="top"/>
-            <w:tcMar>
-              <w:top w:w="60" w:type="dxa"/>
-              <w:start w:w="70" w:type="dxa"/>
-              <w:bottom w:w="60" w:type="dxa"/>
-              <w:end w:w="70" w:type="dxa"/>
-            </w:tcMar>
-          </w:tcPr>
-          <w:p>
-            <w:pPr>
-              <w:spacing w:after="0" w:line="240" w:lineRule="auto"/>
-            </w:pPr>
-            <w:r>
-              <w:rPr>
-                <w:sz w:val="15"/>
-              </w:rPr>
-              <w:t>APIs testadas, ambiente de homologação, reconciliação automática, piloto limitado e plano de contingência.</w:t>
-            </w:r>
-          </w:p>
-        </w:tc>
-      </w:tr>
-      <w:tr>
-        <w:tc>
-          <w:tcPr>
-            <w:tcW w:type="dxa" w:w="2438"/>
-            <w:vAlign w:val="top"/>
-            <w:tcMar>
-              <w:top w:w="60" w:type="dxa"/>
-              <w:start w:w="70" w:type="dxa"/>
-              <w:bottom w:w="60" w:type="dxa"/>
-              <w:end w:w="70" w:type="dxa"/>
-            </w:tcMar>
-          </w:tcPr>
-          <w:p>
-            <w:pPr>
-              <w:spacing w:after="0" w:line="240" w:lineRule="auto"/>
-            </w:pPr>
-            <w:r>
-              <w:rPr>
-                <w:sz w:val="15"/>
-              </w:rPr>
-              <w:t>Estouro de prazo, custo e escopo</w:t>
-            </w:r>
-          </w:p>
-        </w:tc>
-        <w:tc>
-          <w:tcPr>
-            <w:tcW w:type="dxa" w:w="2891"/>
-            <w:vAlign w:val="top"/>
-            <w:tcMar>
-              <w:top w:w="60" w:type="dxa"/>
-              <w:start w:w="70" w:type="dxa"/>
-              <w:bottom w:w="60" w:type="dxa"/>
-              <w:end w:w="70" w:type="dxa"/>
-            </w:tcMar>
-          </w:tcPr>
-          <w:p>
-            <w:pPr>
-              <w:spacing w:after="0" w:line="240" w:lineRule="auto"/>
-            </w:pPr>
-            <w:r>
-              <w:rPr>
-                <w:sz w:val="15"/>
-              </w:rPr>
-              <w:t>Projeto incompleto ou sem benefício econômico.</w:t>
-            </w:r>
-          </w:p>
-        </w:tc>
-        <w:tc>
-          <w:tcPr>
-            <w:tcW w:type="dxa" w:w="4876"/>
-            <w:vAlign w:val="top"/>
-            <w:tcMar>
-              <w:top w:w="60" w:type="dxa"/>
-              <w:start w:w="70" w:type="dxa"/>
-              <w:bottom w:w="60" w:type="dxa"/>
-              <w:end w:w="70" w:type="dxa"/>
-            </w:tcMar>
-          </w:tcPr>
-          <w:p>
-            <w:pPr>
-              <w:spacing w:after="0" w:line="240" w:lineRule="auto"/>
-            </w:pPr>
-            <w:r>
-              <w:rPr>
-                <w:sz w:val="15"/>
-              </w:rPr>
-              <w:t>MVP com escopo fechado, implantação por fases, marcos de decisão, reserva de contingência e controle de custo total de propriedade.</w:t>
-            </w:r>
-          </w:p>
-        </w:tc>
-      </w:tr>
-      <w:tr>
-        <w:tc>
-          <w:tcPr>
-            <w:tcW w:type="dxa" w:w="2438"/>
-            <w:vAlign w:val="top"/>
-            <w:tcMar>
-              <w:top w:w="60" w:type="dxa"/>
-              <w:start w:w="70" w:type="dxa"/>
-              <w:bottom w:w="60" w:type="dxa"/>
-              <w:end w:w="70" w:type="dxa"/>
-            </w:tcMar>
-          </w:tcPr>
-          <w:p>
-            <w:pPr>
-              <w:spacing w:after="0" w:line="240" w:lineRule="auto"/>
-            </w:pPr>
-            <w:r>
-              <w:rPr>
-                <w:sz w:val="15"/>
-              </w:rPr>
-              <w:t>Dependência do fornecedor, segurança e indisponibilidade</w:t>
-            </w:r>
-          </w:p>
-        </w:tc>
-        <w:tc>
-          <w:tcPr>
-            <w:tcW w:type="dxa" w:w="2891"/>
-            <w:vAlign w:val="top"/>
-            <w:tcMar>
-              <w:top w:w="60" w:type="dxa"/>
-              <w:start w:w="70" w:type="dxa"/>
-              <w:bottom w:w="60" w:type="dxa"/>
-              <w:end w:w="70" w:type="dxa"/>
-            </w:tcMar>
-          </w:tcPr>
-          <w:p>
-            <w:pPr>
-              <w:spacing w:after="0" w:line="240" w:lineRule="auto"/>
-            </w:pPr>
-            <w:r>
-              <w:rPr>
-                <w:sz w:val="15"/>
-              </w:rPr>
-              <w:t>Lock-in, vazamento de dados ou parada da operação.</w:t>
-            </w:r>
-          </w:p>
-        </w:tc>
-        <w:tc>
-          <w:tcPr>
-            <w:tcW w:type="dxa" w:w="4876"/>
-            <w:vAlign w:val="top"/>
-            <w:tcMar>
-              <w:top w:w="60" w:type="dxa"/>
-              <w:start w:w="70" w:type="dxa"/>
-              <w:bottom w:w="60" w:type="dxa"/>
-              <w:end w:w="70" w:type="dxa"/>
-            </w:tcMar>
-          </w:tcPr>
-          <w:p>
-            <w:pPr>
-              <w:spacing w:after="0" w:line="240" w:lineRule="auto"/>
-            </w:pPr>
-            <w:r>
-              <w:rPr>
-                <w:sz w:val="15"/>
-              </w:rPr>
-              <w:t>SLA, portabilidade contratual dos dados, padrões abertos, backups testados, perfis de acesso e plano de saída.</w:t>
-            </w:r>
-          </w:p>
-        </w:tc>
-      </w:tr>
-      <w:tr>
-        <w:tc>
-          <w:tcPr>
-            <w:tcW w:type="dxa" w:w="2438"/>
-            <w:vAlign w:val="top"/>
-            <w:tcMar>
-              <w:top w:w="60" w:type="dxa"/>
-              <w:start w:w="70" w:type="dxa"/>
-              <w:bottom w:w="60" w:type="dxa"/>
-              <w:end w:w="70" w:type="dxa"/>
-            </w:tcMar>
-          </w:tcPr>
-          <w:p>
-            <w:pPr>
-              <w:spacing w:after="0" w:line="240" w:lineRule="auto"/>
-            </w:pPr>
-            <w:r>
-              <w:rPr>
-                <w:sz w:val="15"/>
-              </w:rPr>
-              <w:t>Previsão de demanda inadequada</w:t>
-            </w:r>
-          </w:p>
-        </w:tc>
-        <w:tc>
-          <w:tcPr>
-            <w:tcW w:type="dxa" w:w="2891"/>
-            <w:vAlign w:val="top"/>
-            <w:tcMar>
-              <w:top w:w="60" w:type="dxa"/>
-              <w:start w:w="70" w:type="dxa"/>
-              <w:bottom w:w="60" w:type="dxa"/>
-              <w:end w:w="70" w:type="dxa"/>
-            </w:tcMar>
-          </w:tcPr>
-          <w:p>
-            <w:pPr>
-              <w:spacing w:after="0" w:line="240" w:lineRule="auto"/>
-            </w:pPr>
-            <w:r>
-              <w:rPr>
-                <w:sz w:val="15"/>
-              </w:rPr>
-              <w:t>Excesso ou falta de produto mesmo com o SCM.</w:t>
-            </w:r>
-          </w:p>
-        </w:tc>
-        <w:tc>
-          <w:tcPr>
-            <w:tcW w:type="dxa" w:w="4876"/>
-            <w:vAlign w:val="top"/>
-            <w:tcMar>
-              <w:top w:w="60" w:type="dxa"/>
-              <w:start w:w="70" w:type="dxa"/>
-              <w:bottom w:w="60" w:type="dxa"/>
-              <w:end w:w="70" w:type="dxa"/>
-            </w:tcMar>
-          </w:tcPr>
-          <w:p>
-            <w:pPr>
-              <w:spacing w:after="0" w:line="240" w:lineRule="auto"/>
-            </w:pPr>
-            <w:r>
-              <w:rPr>
-                <w:sz w:val="15"/>
-              </w:rPr>
-              <w:t>Revisão humana das previsões, segmentação por SKU, testes por família de produto e melhoria contínua do modelo.</w:t>
-            </w:r>
-          </w:p>
-        </w:tc>
-      </w:tr>
-    </w:tbl>
-    <w:p>
-      <w:pPr>
-        <w:spacing w:after="0"/>
-      </w:pPr>
-    </w:p>
-    <w:p>
-      <w:pPr>
-        <w:pStyle w:val="Section"/>
-        <w:keepNext/>
-      </w:pPr>
       <w:r>
-        <w:t>d) Indicadores mensais de sucesso (KPIs)</w:t>
-      </w:r>
-    </w:p>
-    <w:tbl>
-      <w:tblPr>
-        <w:tblStyle w:val="TableGrid"/>
-        <w:tblW w:type="auto" w:w="0"/>
-        <w:jc w:val="center"/>
-        <w:tblLayout w:type="fixed"/>
-        <w:tblLook w:firstColumn="1" w:firstRow="1" w:lastColumn="0" w:lastRow="0" w:noHBand="0" w:noVBand="1" w:val="04A0"/>
-      </w:tblPr>
-      <w:tblGrid>
-        <w:gridCol w:w="3570"/>
-        <w:gridCol w:w="3570"/>
-        <w:gridCol w:w="3570"/>
-      </w:tblGrid>
-      <w:tr>
-        <w:trPr>
-          <w:tblHeader w:val="true"/>
-        </w:trPr>
-        <w:tc>
-          <w:tcPr>
-            <w:tcW w:type="dxa" w:w="2324"/>
-            <w:shd w:fill="1F4E78"/>
-            <w:vAlign w:val="center"/>
-            <w:tcMar>
-              <w:top w:w="60" w:type="dxa"/>
-              <w:start w:w="70" w:type="dxa"/>
-              <w:bottom w:w="60" w:type="dxa"/>
-              <w:end w:w="70" w:type="dxa"/>
-            </w:tcMar>
-          </w:tcPr>
-          <w:p>
-            <w:pPr>
-              <w:jc w:val="center"/>
-            </w:pPr>
-            <w:r>
-              <w:rPr>
-                <w:b/>
-                <w:color w:val="FFFFFF"/>
-                <w:sz w:val="15"/>
-              </w:rPr>
-              <w:t>KPI</w:t>
-            </w:r>
-          </w:p>
-        </w:tc>
-        <w:tc>
-          <w:tcPr>
-            <w:tcW w:type="dxa" w:w="3969"/>
-            <w:shd w:fill="1F4E78"/>
-            <w:vAlign w:val="center"/>
-            <w:tcMar>
-              <w:top w:w="60" w:type="dxa"/>
-              <w:start w:w="70" w:type="dxa"/>
-              <w:bottom w:w="60" w:type="dxa"/>
-              <w:end w:w="70" w:type="dxa"/>
-            </w:tcMar>
-          </w:tcPr>
-          <w:p>
-            <w:pPr>
-              <w:jc w:val="center"/>
-            </w:pPr>
-            <w:r>
-              <w:rPr>
-                <w:b/>
-                <w:color w:val="FFFFFF"/>
-                <w:sz w:val="15"/>
-              </w:rPr>
-              <w:t>Cálculo</w:t>
-            </w:r>
-          </w:p>
-        </w:tc>
-        <w:tc>
-          <w:tcPr>
-            <w:tcW w:type="dxa" w:w="3912"/>
-            <w:shd w:fill="1F4E78"/>
-            <w:vAlign w:val="center"/>
-            <w:tcMar>
-              <w:top w:w="60" w:type="dxa"/>
-              <w:start w:w="70" w:type="dxa"/>
-              <w:bottom w:w="60" w:type="dxa"/>
-              <w:end w:w="70" w:type="dxa"/>
-            </w:tcMar>
-          </w:tcPr>
-          <w:p>
-            <w:pPr>
-              <w:jc w:val="center"/>
-            </w:pPr>
-            <w:r>
-              <w:rPr>
-                <w:b/>
-                <w:color w:val="FFFFFF"/>
-                <w:sz w:val="15"/>
-              </w:rPr>
-              <w:t>Interpretação</w:t>
-            </w:r>
-          </w:p>
-        </w:tc>
-      </w:tr>
-      <w:tr>
-        <w:tc>
-          <w:tcPr>
-            <w:tcW w:type="dxa" w:w="2324"/>
-            <w:vAlign w:val="top"/>
-            <w:tcMar>
-              <w:top w:w="60" w:type="dxa"/>
-              <w:start w:w="70" w:type="dxa"/>
-              <w:bottom w:w="60" w:type="dxa"/>
-              <w:end w:w="70" w:type="dxa"/>
-            </w:tcMar>
-          </w:tcPr>
-          <w:p>
-            <w:pPr>
-              <w:spacing w:after="0" w:line="240" w:lineRule="auto"/>
-            </w:pPr>
-            <w:r>
-              <w:rPr>
-                <w:sz w:val="15"/>
-              </w:rPr>
-              <w:t>Acurácia do estoque</w:t>
-            </w:r>
-          </w:p>
-        </w:tc>
-        <w:tc>
-          <w:tcPr>
-            <w:tcW w:type="dxa" w:w="3969"/>
-            <w:vAlign w:val="top"/>
-            <w:tcMar>
-              <w:top w:w="60" w:type="dxa"/>
-              <w:start w:w="70" w:type="dxa"/>
-              <w:bottom w:w="60" w:type="dxa"/>
-              <w:end w:w="70" w:type="dxa"/>
-            </w:tcMar>
-          </w:tcPr>
-          <w:p>
-            <w:pPr>
-              <w:spacing w:after="0" w:line="240" w:lineRule="auto"/>
-            </w:pPr>
-            <w:r>
-              <w:rPr>
-                <w:sz w:val="15"/>
-              </w:rPr>
-              <w:t>1 − |quantidade no sistema − quantidade física| / quantidade física</w:t>
-            </w:r>
-          </w:p>
-        </w:tc>
-        <w:tc>
-          <w:tcPr>
-            <w:tcW w:type="dxa" w:w="3912"/>
-            <w:vAlign w:val="top"/>
-            <w:tcMar>
-              <w:top w:w="60" w:type="dxa"/>
-              <w:start w:w="70" w:type="dxa"/>
-              <w:bottom w:w="60" w:type="dxa"/>
-              <w:end w:w="70" w:type="dxa"/>
-            </w:tcMar>
-          </w:tcPr>
-          <w:p>
-            <w:pPr>
-              <w:spacing w:after="0" w:line="240" w:lineRule="auto"/>
-            </w:pPr>
-            <w:r>
-              <w:rPr>
-                <w:sz w:val="15"/>
-              </w:rPr>
-              <w:t>↑ Mede se o SCM se tornou a fonte confiável por SKU e fábrica.</w:t>
-            </w:r>
-          </w:p>
-        </w:tc>
-      </w:tr>
-      <w:tr>
-        <w:tc>
-          <w:tcPr>
-            <w:tcW w:type="dxa" w:w="2324"/>
-            <w:vAlign w:val="top"/>
-            <w:tcMar>
-              <w:top w:w="60" w:type="dxa"/>
-              <w:start w:w="70" w:type="dxa"/>
-              <w:bottom w:w="60" w:type="dxa"/>
-              <w:end w:w="70" w:type="dxa"/>
-            </w:tcMar>
-          </w:tcPr>
-          <w:p>
-            <w:pPr>
-              <w:spacing w:after="0" w:line="240" w:lineRule="auto"/>
-            </w:pPr>
-            <w:r>
-              <w:rPr>
-                <w:sz w:val="15"/>
-              </w:rPr>
-              <w:t>Taxa de ruptura</w:t>
-            </w:r>
-          </w:p>
-        </w:tc>
-        <w:tc>
-          <w:tcPr>
-            <w:tcW w:type="dxa" w:w="3969"/>
-            <w:vAlign w:val="top"/>
-            <w:tcMar>
-              <w:top w:w="60" w:type="dxa"/>
-              <w:start w:w="70" w:type="dxa"/>
-              <w:bottom w:w="60" w:type="dxa"/>
-              <w:end w:w="70" w:type="dxa"/>
-            </w:tcMar>
-          </w:tcPr>
-          <w:p>
-            <w:pPr>
-              <w:spacing w:after="0" w:line="240" w:lineRule="auto"/>
-            </w:pPr>
-            <w:r>
-              <w:rPr>
-                <w:sz w:val="15"/>
-              </w:rPr>
-              <w:t>Itens/localizações indisponíveis ÷ itens/localizações demandados</w:t>
-            </w:r>
-          </w:p>
-        </w:tc>
-        <w:tc>
-          <w:tcPr>
-            <w:tcW w:type="dxa" w:w="3912"/>
-            <w:vAlign w:val="top"/>
-            <w:tcMar>
-              <w:top w:w="60" w:type="dxa"/>
-              <w:start w:w="70" w:type="dxa"/>
-              <w:bottom w:w="60" w:type="dxa"/>
-              <w:end w:w="70" w:type="dxa"/>
-            </w:tcMar>
-          </w:tcPr>
-          <w:p>
-            <w:pPr>
-              <w:spacing w:after="0" w:line="240" w:lineRule="auto"/>
-            </w:pPr>
-            <w:r>
-              <w:rPr>
-                <w:sz w:val="15"/>
-              </w:rPr>
-              <w:t>↓ Captura perda de venda e falha de reposição.</w:t>
-            </w:r>
-          </w:p>
-        </w:tc>
-      </w:tr>
-      <w:tr>
-        <w:tc>
-          <w:tcPr>
-            <w:tcW w:type="dxa" w:w="2324"/>
-            <w:vAlign w:val="top"/>
-            <w:tcMar>
-              <w:top w:w="60" w:type="dxa"/>
-              <w:start w:w="70" w:type="dxa"/>
-              <w:bottom w:w="60" w:type="dxa"/>
-              <w:end w:w="70" w:type="dxa"/>
-            </w:tcMar>
-          </w:tcPr>
-          <w:p>
-            <w:pPr>
-              <w:spacing w:after="0" w:line="240" w:lineRule="auto"/>
-            </w:pPr>
-            <w:r>
-              <w:rPr>
-                <w:sz w:val="15"/>
-              </w:rPr>
-              <w:t>Perdas por vencimento</w:t>
-            </w:r>
-          </w:p>
-        </w:tc>
-        <w:tc>
-          <w:tcPr>
-            <w:tcW w:type="dxa" w:w="3969"/>
-            <w:vAlign w:val="top"/>
-            <w:tcMar>
-              <w:top w:w="60" w:type="dxa"/>
-              <w:start w:w="70" w:type="dxa"/>
-              <w:bottom w:w="60" w:type="dxa"/>
-              <w:end w:w="70" w:type="dxa"/>
-            </w:tcMar>
-          </w:tcPr>
-          <w:p>
-            <w:pPr>
-              <w:spacing w:after="0" w:line="240" w:lineRule="auto"/>
-            </w:pPr>
-            <w:r>
-              <w:rPr>
-                <w:sz w:val="15"/>
-              </w:rPr>
-              <w:t>Valor descartado por validade ÷ valor produzido ou movimentado</w:t>
-            </w:r>
-          </w:p>
-        </w:tc>
-        <w:tc>
-          <w:tcPr>
-            <w:tcW w:type="dxa" w:w="3912"/>
-            <w:vAlign w:val="top"/>
-            <w:tcMar>
-              <w:top w:w="60" w:type="dxa"/>
-              <w:start w:w="70" w:type="dxa"/>
-              <w:bottom w:w="60" w:type="dxa"/>
-              <w:end w:w="70" w:type="dxa"/>
-            </w:tcMar>
-          </w:tcPr>
-          <w:p>
-            <w:pPr>
-              <w:spacing w:after="0" w:line="240" w:lineRule="auto"/>
-            </w:pPr>
-            <w:r>
-              <w:rPr>
-                <w:sz w:val="15"/>
-              </w:rPr>
-              <w:t>↓ Conecta validade, excesso de estoque e impacto financeiro.</w:t>
-            </w:r>
-          </w:p>
-        </w:tc>
-      </w:tr>
-      <w:tr>
-        <w:tc>
-          <w:tcPr>
-            <w:tcW w:type="dxa" w:w="2324"/>
-            <w:vAlign w:val="top"/>
-            <w:tcMar>
-              <w:top w:w="60" w:type="dxa"/>
-              <w:start w:w="70" w:type="dxa"/>
-              <w:bottom w:w="60" w:type="dxa"/>
-              <w:end w:w="70" w:type="dxa"/>
-            </w:tcMar>
-          </w:tcPr>
-          <w:p>
-            <w:pPr>
-              <w:spacing w:after="0" w:line="240" w:lineRule="auto"/>
-            </w:pPr>
-            <w:r>
-              <w:rPr>
-                <w:sz w:val="15"/>
-              </w:rPr>
-              <w:t>OTIF — entrega no prazo e completa</w:t>
-            </w:r>
-          </w:p>
-        </w:tc>
-        <w:tc>
-          <w:tcPr>
-            <w:tcW w:type="dxa" w:w="3969"/>
-            <w:vAlign w:val="top"/>
-            <w:tcMar>
-              <w:top w:w="60" w:type="dxa"/>
-              <w:start w:w="70" w:type="dxa"/>
-              <w:bottom w:w="60" w:type="dxa"/>
-              <w:end w:w="70" w:type="dxa"/>
-            </w:tcMar>
-          </w:tcPr>
-          <w:p>
-            <w:pPr>
-              <w:spacing w:after="0" w:line="240" w:lineRule="auto"/>
-            </w:pPr>
-            <w:r>
-              <w:rPr>
-                <w:sz w:val="15"/>
-              </w:rPr>
-              <w:t>Pedidos entregues completos e no prazo ÷ total de pedidos</w:t>
-            </w:r>
-          </w:p>
-        </w:tc>
-        <w:tc>
-          <w:tcPr>
-            <w:tcW w:type="dxa" w:w="3912"/>
-            <w:vAlign w:val="top"/>
-            <w:tcMar>
-              <w:top w:w="60" w:type="dxa"/>
-              <w:start w:w="70" w:type="dxa"/>
-              <w:bottom w:w="60" w:type="dxa"/>
-              <w:end w:w="70" w:type="dxa"/>
-            </w:tcMar>
-          </w:tcPr>
-          <w:p>
-            <w:pPr>
-              <w:spacing w:after="0" w:line="240" w:lineRule="auto"/>
-            </w:pPr>
-            <w:r>
-              <w:rPr>
-                <w:sz w:val="15"/>
-              </w:rPr>
-              <w:t>↑ Mede o nível de serviço logístico ao cliente.</w:t>
-            </w:r>
-          </w:p>
-        </w:tc>
-      </w:tr>
-      <w:tr>
-        <w:tc>
-          <w:tcPr>
-            <w:tcW w:type="dxa" w:w="2324"/>
-            <w:vAlign w:val="top"/>
-            <w:tcMar>
-              <w:top w:w="60" w:type="dxa"/>
-              <w:start w:w="70" w:type="dxa"/>
-              <w:bottom w:w="60" w:type="dxa"/>
-              <w:end w:w="70" w:type="dxa"/>
-            </w:tcMar>
-          </w:tcPr>
-          <w:p>
-            <w:pPr>
-              <w:spacing w:after="0" w:line="240" w:lineRule="auto"/>
-            </w:pPr>
-            <w:r>
-              <w:rPr>
-                <w:sz w:val="15"/>
-              </w:rPr>
-              <w:t>Giro e cobertura de estoque</w:t>
-            </w:r>
-          </w:p>
-        </w:tc>
-        <w:tc>
-          <w:tcPr>
-            <w:tcW w:type="dxa" w:w="3969"/>
-            <w:vAlign w:val="top"/>
-            <w:tcMar>
-              <w:top w:w="60" w:type="dxa"/>
-              <w:start w:w="70" w:type="dxa"/>
-              <w:bottom w:w="60" w:type="dxa"/>
-              <w:end w:w="70" w:type="dxa"/>
-            </w:tcMar>
-          </w:tcPr>
-          <w:p>
-            <w:pPr>
-              <w:spacing w:after="0" w:line="240" w:lineRule="auto"/>
-            </w:pPr>
-            <w:r>
-              <w:rPr>
-                <w:sz w:val="15"/>
-              </w:rPr>
-              <w:t>CMV ÷ estoque médio; e dias de estoque disponível</w:t>
-            </w:r>
-          </w:p>
-        </w:tc>
-        <w:tc>
-          <w:tcPr>
-            <w:tcW w:type="dxa" w:w="3912"/>
-            <w:vAlign w:val="top"/>
-            <w:tcMar>
-              <w:top w:w="60" w:type="dxa"/>
-              <w:start w:w="70" w:type="dxa"/>
-              <w:bottom w:w="60" w:type="dxa"/>
-              <w:end w:w="70" w:type="dxa"/>
-            </w:tcMar>
-          </w:tcPr>
-          <w:p>
-            <w:pPr>
-              <w:spacing w:after="0" w:line="240" w:lineRule="auto"/>
-            </w:pPr>
-            <w:r>
-              <w:rPr>
-                <w:sz w:val="15"/>
-              </w:rPr>
-              <w:t>Otimizar por categoria, evitando excesso e falta.</w:t>
-            </w:r>
-          </w:p>
-        </w:tc>
-      </w:tr>
-      <w:tr>
-        <w:tc>
-          <w:tcPr>
-            <w:tcW w:type="dxa" w:w="2324"/>
-            <w:vAlign w:val="top"/>
-            <w:tcMar>
-              <w:top w:w="60" w:type="dxa"/>
-              <w:start w:w="70" w:type="dxa"/>
-              <w:bottom w:w="60" w:type="dxa"/>
-              <w:end w:w="70" w:type="dxa"/>
-            </w:tcMar>
-          </w:tcPr>
-          <w:p>
-            <w:pPr>
-              <w:spacing w:after="0" w:line="240" w:lineRule="auto"/>
-            </w:pPr>
-            <w:r>
-              <w:rPr>
-                <w:sz w:val="15"/>
-              </w:rPr>
-              <w:t>Erro de previsão (MAPE)</w:t>
-            </w:r>
-          </w:p>
-        </w:tc>
-        <w:tc>
-          <w:tcPr>
-            <w:tcW w:type="dxa" w:w="3969"/>
-            <w:vAlign w:val="top"/>
-            <w:tcMar>
-              <w:top w:w="60" w:type="dxa"/>
-              <w:start w:w="70" w:type="dxa"/>
-              <w:bottom w:w="60" w:type="dxa"/>
-              <w:end w:w="70" w:type="dxa"/>
-            </w:tcMar>
-          </w:tcPr>
-          <w:p>
-            <w:pPr>
-              <w:spacing w:after="0" w:line="240" w:lineRule="auto"/>
-            </w:pPr>
-            <w:r>
-              <w:rPr>
-                <w:sz w:val="15"/>
-              </w:rPr>
-              <w:t>Média de |real − previsto| / real, por SKU/família</w:t>
-            </w:r>
-          </w:p>
-        </w:tc>
-        <w:tc>
-          <w:tcPr>
-            <w:tcW w:type="dxa" w:w="3912"/>
-            <w:vAlign w:val="top"/>
-            <w:tcMar>
-              <w:top w:w="60" w:type="dxa"/>
-              <w:start w:w="70" w:type="dxa"/>
-              <w:bottom w:w="60" w:type="dxa"/>
-              <w:end w:w="70" w:type="dxa"/>
-            </w:tcMar>
-          </w:tcPr>
-          <w:p>
-            <w:pPr>
-              <w:spacing w:after="0" w:line="240" w:lineRule="auto"/>
-            </w:pPr>
-            <w:r>
-              <w:rPr>
-                <w:sz w:val="15"/>
-              </w:rPr>
-              <w:t>↓ Verifica a qualidade do planejamento de demanda.</w:t>
-            </w:r>
-          </w:p>
-        </w:tc>
-      </w:tr>
-      <w:tr>
-        <w:tc>
-          <w:tcPr>
-            <w:tcW w:type="dxa" w:w="2324"/>
-            <w:vAlign w:val="top"/>
-            <w:tcMar>
-              <w:top w:w="60" w:type="dxa"/>
-              <w:start w:w="70" w:type="dxa"/>
-              <w:bottom w:w="60" w:type="dxa"/>
-              <w:end w:w="70" w:type="dxa"/>
-            </w:tcMar>
-          </w:tcPr>
-          <w:p>
-            <w:pPr>
-              <w:spacing w:after="0" w:line="240" w:lineRule="auto"/>
-            </w:pPr>
-            <w:r>
-              <w:rPr>
-                <w:sz w:val="15"/>
-              </w:rPr>
-              <w:t>Tempo de fechamento do relatório</w:t>
-            </w:r>
-          </w:p>
-        </w:tc>
-        <w:tc>
-          <w:tcPr>
-            <w:tcW w:type="dxa" w:w="3969"/>
-            <w:vAlign w:val="top"/>
-            <w:tcMar>
-              <w:top w:w="60" w:type="dxa"/>
-              <w:start w:w="70" w:type="dxa"/>
-              <w:bottom w:w="60" w:type="dxa"/>
-              <w:end w:w="70" w:type="dxa"/>
-            </w:tcMar>
-          </w:tcPr>
-          <w:p>
-            <w:pPr>
-              <w:spacing w:after="0" w:line="240" w:lineRule="auto"/>
-            </w:pPr>
-            <w:r>
-              <w:rPr>
-                <w:sz w:val="15"/>
-              </w:rPr>
-              <w:t>Horas/dias entre o fim do mês e o painel validado</w:t>
-            </w:r>
-          </w:p>
-        </w:tc>
-        <w:tc>
-          <w:tcPr>
-            <w:tcW w:type="dxa" w:w="3912"/>
-            <w:vAlign w:val="top"/>
-            <w:tcMar>
-              <w:top w:w="60" w:type="dxa"/>
-              <w:start w:w="70" w:type="dxa"/>
-              <w:bottom w:w="60" w:type="dxa"/>
-              <w:end w:w="70" w:type="dxa"/>
-            </w:tcMar>
-          </w:tcPr>
-          <w:p>
-            <w:pPr>
-              <w:spacing w:after="0" w:line="240" w:lineRule="auto"/>
-            </w:pPr>
-            <w:r>
-              <w:rPr>
-                <w:sz w:val="15"/>
-              </w:rPr>
-              <w:t>↓ Demonstra ganho de integração e qualidade dos dados.</w:t>
-            </w:r>
-          </w:p>
-        </w:tc>
-      </w:tr>
-    </w:tbl>
-    <w:p>
-      <w:pPr>
-        <w:spacing w:after="0"/>
-      </w:pPr>
-    </w:p>
-    <w:p>
-      <w:r>
-        <w:t>Antes do piloto, a Sabor &amp; Cia deve medir a linha de base de cada KPI. As metas numéricas só devem ser pactuadas após essa medição, para evitar objetivos arbitrários. O acompanhamento deve ser segmentado por fábrica, produto e canal, com um responsável e plano de ação para desvios.</w:t>
+        <w:rPr>
+          <w:rFonts w:ascii="Arial" w:hAnsi="Arial" w:eastAsia="Arial"/>
+          <w:sz w:val="24"/>
+        </w:rPr>
+        <w:t>Um sistema de Gestão do Conhecimento deve registrar procedimentos, soluções de falhas e lições aprendidas em uma base pesquisável, com documentos, vídeos e checklists. Cultura, apoio gerencial, treinamento e qualidade do conteúdo são fatores críticos (Alam et al., 2025).</w:t>
       </w:r>
     </w:p>
     <w:p>
       <w:pPr>
-        <w:pStyle w:val="Section"/>
-        <w:keepNext/>
+        <w:pStyle w:val="PlainHeading"/>
       </w:pPr>
       <w:r>
+        <w:rPr>
+          <w:rFonts w:ascii="Arial" w:hAnsi="Arial" w:eastAsia="Arial"/>
+          <w:sz w:val="24"/>
+        </w:rPr>
+        <w:t>b) Priorização</w:t>
+      </w:r>
+    </w:p>
+    <w:p>
+      <w:pPr>
+        <w:jc w:val="both"/>
+      </w:pPr>
+      <w:r>
+        <w:rPr>
+          <w:rFonts w:ascii="Arial" w:hAnsi="Arial" w:eastAsia="Arial"/>
+          <w:sz w:val="24"/>
+        </w:rPr>
+        <w:t>A primeira implementação deve ser o SCM, privilegiando Operações e Cadeia de Suprimentos. O escopo inicial deve incluir estoque, planejamento de demanda, reposição, lotes e validade e logística. Essa escolha ataca os prejuízos mais imediatos do caso: descarte de perecíveis, vendas perdidas por ruptura, atrasos e capital imobilizado. Também cria dados operacionais mais confiáveis para o BI.</w:t>
+      </w:r>
+    </w:p>
+    <w:p>
+      <w:pPr>
+        <w:jc w:val="both"/>
+      </w:pPr>
+      <w:r>
+        <w:rPr>
+          <w:rFonts w:ascii="Arial" w:hAnsi="Arial" w:eastAsia="Arial"/>
+          <w:sz w:val="24"/>
+        </w:rPr>
+        <w:t>Não recomendamos implantar um ERP completo em formato “big bang” no primeiro ano. O orçamento é limitado, a implantação é longa e exige redesenho de processos, migração e mudança organizacional. Uma revisão de 126 publicações identifica implementação, integração, participação dos usuários, tomada de decisão e gestão de riscos entre as principais preocupações associadas a ERP (Martins &amp; Belfo, 2023). O sistema de faturamento atual pode permanecer temporariamente, integrado ao SCM por API.</w:t>
+      </w:r>
+    </w:p>
+    <w:p>
+      <w:pPr>
+        <w:pStyle w:val="PlainBullet"/>
+      </w:pPr>
+      <w:r>
+        <w:rPr>
+          <w:rFonts w:ascii="Arial" w:hAnsi="Arial" w:eastAsia="Arial"/>
+          <w:b/>
+          <w:sz w:val="24"/>
+        </w:rPr>
+        <w:t xml:space="preserve">• Fase 1 — Preparação (0–2 meses). </w:t>
+      </w:r>
+      <w:r>
+        <w:rPr>
+          <w:rFonts w:ascii="Arial" w:hAnsi="Arial" w:eastAsia="Arial"/>
+          <w:sz w:val="24"/>
+        </w:rPr>
+        <w:t>Mapear processos, definir responsáveis pelos dados, padronizar produtos, unidades, lotes e validade e realizar uma contagem física inicial.</w:t>
+      </w:r>
+    </w:p>
+    <w:p>
+      <w:pPr>
+        <w:pStyle w:val="PlainBullet"/>
+      </w:pPr>
+      <w:r>
+        <w:rPr>
+          <w:rFonts w:ascii="Arial" w:hAnsi="Arial" w:eastAsia="Arial"/>
+          <w:b/>
+          <w:sz w:val="24"/>
+        </w:rPr>
+        <w:t xml:space="preserve">• Fase 2 — Piloto (3–5 meses). </w:t>
+      </w:r>
+      <w:r>
+        <w:rPr>
+          <w:rFonts w:ascii="Arial" w:hAnsi="Arial" w:eastAsia="Arial"/>
+          <w:sz w:val="24"/>
+        </w:rPr>
+        <w:t>Implantar o SCM em uma fábrica e em um fluxo de distribuição, com integração ao faturamento e período curto de conferência paralela.</w:t>
+      </w:r>
+    </w:p>
+    <w:p>
+      <w:pPr>
+        <w:pStyle w:val="PlainBullet"/>
+      </w:pPr>
+      <w:r>
+        <w:rPr>
+          <w:rFonts w:ascii="Arial" w:hAnsi="Arial" w:eastAsia="Arial"/>
+          <w:b/>
+          <w:sz w:val="24"/>
+        </w:rPr>
+        <w:t xml:space="preserve">• Fase 3 — Expansão (6–10 meses). </w:t>
+      </w:r>
+      <w:r>
+        <w:rPr>
+          <w:rFonts w:ascii="Arial" w:hAnsi="Arial" w:eastAsia="Arial"/>
+          <w:sz w:val="24"/>
+        </w:rPr>
+        <w:t>Corrigir as falhas do piloto, treinar usuários-chave e ampliar a solução para as outras duas fábricas e para a logística nacional.</w:t>
+      </w:r>
+    </w:p>
+    <w:p>
+      <w:pPr>
+        <w:pStyle w:val="PlainBullet"/>
+      </w:pPr>
+      <w:r>
+        <w:rPr>
+          <w:rFonts w:ascii="Arial" w:hAnsi="Arial" w:eastAsia="Arial"/>
+          <w:b/>
+          <w:sz w:val="24"/>
+        </w:rPr>
+        <w:t xml:space="preserve">• Fase 4 — Consolidação (11–12 meses). </w:t>
+      </w:r>
+      <w:r>
+        <w:rPr>
+          <w:rFonts w:ascii="Arial" w:hAnsi="Arial" w:eastAsia="Arial"/>
+          <w:sz w:val="24"/>
+        </w:rPr>
+        <w:t>Ativar um painel básico de BI e formalizar a rotina de melhoria. CRM e KMS entram na sequência, embora a documentação dos procedimentos críticos possa começar imediatamente.</w:t>
+      </w:r>
+    </w:p>
+    <w:p>
+      <w:pPr>
+        <w:pStyle w:val="PlainHeading"/>
+      </w:pPr>
+      <w:r>
+        <w:rPr>
+          <w:rFonts w:ascii="Arial" w:hAnsi="Arial" w:eastAsia="Arial"/>
+          <w:sz w:val="24"/>
+        </w:rPr>
+        <w:t>c) Riscos</w:t>
+      </w:r>
+    </w:p>
+    <w:p>
+      <w:pPr>
+        <w:pStyle w:val="PlainBullet"/>
+      </w:pPr>
+      <w:r>
+        <w:rPr>
+          <w:rFonts w:ascii="Arial" w:hAnsi="Arial" w:eastAsia="Arial"/>
+          <w:b/>
+          <w:sz w:val="24"/>
+        </w:rPr>
+        <w:t xml:space="preserve">• 1. Dados incorretos ou incompletos. </w:t>
+      </w:r>
+      <w:r>
+        <w:rPr>
+          <w:rFonts w:ascii="Arial" w:hAnsi="Arial" w:eastAsia="Arial"/>
+          <w:sz w:val="24"/>
+        </w:rPr>
+        <w:t>Previsões e reposições podem continuar erradas. A mitigação exige saneamento de cadastros, contagem física, regras de validação, responsáveis por dados e auditorias mensais.</w:t>
+      </w:r>
+    </w:p>
+    <w:p>
+      <w:pPr>
+        <w:pStyle w:val="PlainBullet"/>
+      </w:pPr>
+      <w:r>
+        <w:rPr>
+          <w:rFonts w:ascii="Arial" w:hAnsi="Arial" w:eastAsia="Arial"/>
+          <w:b/>
+          <w:sz w:val="24"/>
+        </w:rPr>
+        <w:t xml:space="preserve">• 2. Resistência dos funcionários. </w:t>
+      </w:r>
+      <w:r>
+        <w:rPr>
+          <w:rFonts w:ascii="Arial" w:hAnsi="Arial" w:eastAsia="Arial"/>
+          <w:sz w:val="24"/>
+        </w:rPr>
+        <w:t>Os usuários podem manter planilhas paralelas. A empresa deve envolvê-los no desenho, treinar por função, criar suporte local, medir adesão e eliminar gradualmente os controles antigos.</w:t>
+      </w:r>
+    </w:p>
+    <w:p>
+      <w:pPr>
+        <w:pStyle w:val="PlainBullet"/>
+      </w:pPr>
+      <w:r>
+        <w:rPr>
+          <w:rFonts w:ascii="Arial" w:hAnsi="Arial" w:eastAsia="Arial"/>
+          <w:b/>
+          <w:sz w:val="24"/>
+        </w:rPr>
+        <w:t xml:space="preserve">• 3. Falhas de integração. </w:t>
+      </w:r>
+      <w:r>
+        <w:rPr>
+          <w:rFonts w:ascii="Arial" w:hAnsi="Arial" w:eastAsia="Arial"/>
+          <w:sz w:val="24"/>
+        </w:rPr>
+        <w:t>Problemas entre SCM, faturamento e sistemas legados podem gerar pedidos duplicados ou saldos divergentes. A resposta é testar APIs, homologar antes da produção, reconciliar dados e manter um plano de contingência.</w:t>
+      </w:r>
+    </w:p>
+    <w:p>
+      <w:pPr>
+        <w:pStyle w:val="PlainBullet"/>
+      </w:pPr>
+      <w:r>
+        <w:rPr>
+          <w:rFonts w:ascii="Arial" w:hAnsi="Arial" w:eastAsia="Arial"/>
+          <w:b/>
+          <w:sz w:val="24"/>
+        </w:rPr>
+        <w:t xml:space="preserve">• 4. Estouro de prazo, custo e escopo. </w:t>
+      </w:r>
+      <w:r>
+        <w:rPr>
+          <w:rFonts w:ascii="Arial" w:hAnsi="Arial" w:eastAsia="Arial"/>
+          <w:sz w:val="24"/>
+        </w:rPr>
+        <w:t>O projeto deve começar com um produto mínimo viável, escopo fechado, implantação por fases, marcos de decisão e controle do custo total de propriedade.</w:t>
+      </w:r>
+    </w:p>
+    <w:p>
+      <w:pPr>
+        <w:pStyle w:val="PlainBullet"/>
+      </w:pPr>
+      <w:r>
+        <w:rPr>
+          <w:rFonts w:ascii="Arial" w:hAnsi="Arial" w:eastAsia="Arial"/>
+          <w:b/>
+          <w:sz w:val="24"/>
+        </w:rPr>
+        <w:t xml:space="preserve">• 5. Dependência do fornecedor e segurança. </w:t>
+      </w:r>
+      <w:r>
+        <w:rPr>
+          <w:rFonts w:ascii="Arial" w:hAnsi="Arial" w:eastAsia="Arial"/>
+          <w:sz w:val="24"/>
+        </w:rPr>
+        <w:t>A empresa deve exigir acordo de nível de serviço, portabilidade dos dados, padrões abertos, backups testados, controle de acesso e plano de saída.</w:t>
+      </w:r>
+    </w:p>
+    <w:p>
+      <w:pPr>
+        <w:pStyle w:val="PlainBullet"/>
+      </w:pPr>
+      <w:r>
+        <w:rPr>
+          <w:rFonts w:ascii="Arial" w:hAnsi="Arial" w:eastAsia="Arial"/>
+          <w:b/>
+          <w:sz w:val="24"/>
+        </w:rPr>
+        <w:t xml:space="preserve">• 6. Previsão de demanda inadequada. </w:t>
+      </w:r>
+      <w:r>
+        <w:rPr>
+          <w:rFonts w:ascii="Arial" w:hAnsi="Arial" w:eastAsia="Arial"/>
+          <w:sz w:val="24"/>
+        </w:rPr>
+        <w:t>Mesmo com o SCM, modelos ruins podem gerar excesso ou falta. A empresa deve revisar previsões, segmentar por produto e testar o modelo antes da expansão.</w:t>
+      </w:r>
+    </w:p>
+    <w:p>
+      <w:pPr>
+        <w:pStyle w:val="PlainHeading"/>
+      </w:pPr>
+      <w:r>
+        <w:rPr>
+          <w:rFonts w:ascii="Arial" w:hAnsi="Arial" w:eastAsia="Arial"/>
+          <w:sz w:val="24"/>
+        </w:rPr>
+        <w:t>d) Indicadores mensais de sucesso (KPIs)</w:t>
+      </w:r>
+    </w:p>
+    <w:p>
+      <w:pPr>
+        <w:pStyle w:val="PlainBullet"/>
+      </w:pPr>
+      <w:r>
+        <w:rPr>
+          <w:rFonts w:ascii="Arial" w:hAnsi="Arial" w:eastAsia="Arial"/>
+          <w:b/>
+          <w:sz w:val="24"/>
+        </w:rPr>
+        <w:t xml:space="preserve">• 1. Acurácia do estoque. </w:t>
+      </w:r>
+      <w:r>
+        <w:rPr>
+          <w:rFonts w:ascii="Arial" w:hAnsi="Arial" w:eastAsia="Arial"/>
+          <w:sz w:val="24"/>
+        </w:rPr>
+        <w:t>Comparação entre a quantidade registrada e a contagem física por produto e fábrica. Quanto maior, melhor.</w:t>
+      </w:r>
+    </w:p>
+    <w:p>
+      <w:pPr>
+        <w:pStyle w:val="PlainBullet"/>
+      </w:pPr>
+      <w:r>
+        <w:rPr>
+          <w:rFonts w:ascii="Arial" w:hAnsi="Arial" w:eastAsia="Arial"/>
+          <w:b/>
+          <w:sz w:val="24"/>
+        </w:rPr>
+        <w:t xml:space="preserve">• 2. Taxa de ruptura. </w:t>
+      </w:r>
+      <w:r>
+        <w:rPr>
+          <w:rFonts w:ascii="Arial" w:hAnsi="Arial" w:eastAsia="Arial"/>
+          <w:sz w:val="24"/>
+        </w:rPr>
+        <w:t>Percentual de produtos ou localizações indisponíveis diante da demanda. Quanto menor, melhor.</w:t>
+      </w:r>
+    </w:p>
+    <w:p>
+      <w:pPr>
+        <w:pStyle w:val="PlainBullet"/>
+      </w:pPr>
+      <w:r>
+        <w:rPr>
+          <w:rFonts w:ascii="Arial" w:hAnsi="Arial" w:eastAsia="Arial"/>
+          <w:b/>
+          <w:sz w:val="24"/>
+        </w:rPr>
+        <w:t xml:space="preserve">• 3. Perdas por vencimento. </w:t>
+      </w:r>
+      <w:r>
+        <w:rPr>
+          <w:rFonts w:ascii="Arial" w:hAnsi="Arial" w:eastAsia="Arial"/>
+          <w:sz w:val="24"/>
+        </w:rPr>
+        <w:t>Valor descartado por validade dividido pelo valor produzido ou movimentado. Quanto menor, melhor.</w:t>
+      </w:r>
+    </w:p>
+    <w:p>
+      <w:pPr>
+        <w:pStyle w:val="PlainBullet"/>
+      </w:pPr>
+      <w:r>
+        <w:rPr>
+          <w:rFonts w:ascii="Arial" w:hAnsi="Arial" w:eastAsia="Arial"/>
+          <w:b/>
+          <w:sz w:val="24"/>
+        </w:rPr>
+        <w:t xml:space="preserve">• 4. OTIF. </w:t>
+      </w:r>
+      <w:r>
+        <w:rPr>
+          <w:rFonts w:ascii="Arial" w:hAnsi="Arial" w:eastAsia="Arial"/>
+          <w:sz w:val="24"/>
+        </w:rPr>
+        <w:t>Percentual de pedidos entregues completos e dentro do prazo. Quanto maior, melhor.</w:t>
+      </w:r>
+    </w:p>
+    <w:p>
+      <w:pPr>
+        <w:pStyle w:val="PlainBullet"/>
+      </w:pPr>
+      <w:r>
+        <w:rPr>
+          <w:rFonts w:ascii="Arial" w:hAnsi="Arial" w:eastAsia="Arial"/>
+          <w:b/>
+          <w:sz w:val="24"/>
+        </w:rPr>
+        <w:t xml:space="preserve">• 5. Giro e cobertura de estoque. </w:t>
+      </w:r>
+      <w:r>
+        <w:rPr>
+          <w:rFonts w:ascii="Arial" w:hAnsi="Arial" w:eastAsia="Arial"/>
+          <w:sz w:val="24"/>
+        </w:rPr>
+        <w:t>O giro relaciona custo das mercadorias vendidas e estoque médio; a cobertura mede os dias de estoque disponível. O objetivo é equilibrar excesso e falta.</w:t>
+      </w:r>
+    </w:p>
+    <w:p>
+      <w:pPr>
+        <w:pStyle w:val="PlainBullet"/>
+      </w:pPr>
+      <w:r>
+        <w:rPr>
+          <w:rFonts w:ascii="Arial" w:hAnsi="Arial" w:eastAsia="Arial"/>
+          <w:b/>
+          <w:sz w:val="24"/>
+        </w:rPr>
+        <w:t xml:space="preserve">• 6. Erro de previsão (MAPE). </w:t>
+      </w:r>
+      <w:r>
+        <w:rPr>
+          <w:rFonts w:ascii="Arial" w:hAnsi="Arial" w:eastAsia="Arial"/>
+          <w:sz w:val="24"/>
+        </w:rPr>
+        <w:t>Média do erro percentual absoluto entre a demanda real e a prevista, por produto ou família. Quanto menor, melhor.</w:t>
+      </w:r>
+    </w:p>
+    <w:p>
+      <w:pPr>
+        <w:pStyle w:val="PlainBullet"/>
+      </w:pPr>
+      <w:r>
+        <w:rPr>
+          <w:rFonts w:ascii="Arial" w:hAnsi="Arial" w:eastAsia="Arial"/>
+          <w:b/>
+          <w:sz w:val="24"/>
+        </w:rPr>
+        <w:t xml:space="preserve">• 7. Tempo de fechamento do relatório. </w:t>
+      </w:r>
+      <w:r>
+        <w:rPr>
+          <w:rFonts w:ascii="Arial" w:hAnsi="Arial" w:eastAsia="Arial"/>
+          <w:sz w:val="24"/>
+        </w:rPr>
+        <w:t>Horas ou dias entre o fim do mês e a disponibilização do painel validado. Quanto menor, melhor.</w:t>
+      </w:r>
+    </w:p>
+    <w:p>
+      <w:pPr>
+        <w:jc w:val="both"/>
+      </w:pPr>
+      <w:r>
+        <w:rPr>
+          <w:rFonts w:ascii="Arial" w:hAnsi="Arial" w:eastAsia="Arial"/>
+          <w:sz w:val="24"/>
+        </w:rPr>
+        <w:t>Antes do piloto, a Sabor &amp; Cia deve medir a situação inicial de cada indicador. As metas numéricas só devem ser definidas depois dessa medição, para evitar objetivos arbitrários. O acompanhamento deve ser separado por fábrica, produto e canal.</w:t>
+      </w:r>
+    </w:p>
+    <w:p>
+      <w:pPr>
+        <w:pStyle w:val="PlainHeading"/>
+      </w:pPr>
+      <w:r>
+        <w:rPr>
+          <w:rFonts w:ascii="Arial" w:hAnsi="Arial" w:eastAsia="Arial"/>
+          <w:sz w:val="24"/>
+        </w:rPr>
         <w:t>Referências</w:t>
       </w:r>
     </w:p>
     <w:p>
       <w:pPr>
-        <w:spacing w:after="20" w:line="240" w:lineRule="auto"/>
-        <w:ind w:left="255" w:hanging="255"/>
+        <w:spacing w:after="80" w:line="240" w:lineRule="auto"/>
+        <w:ind w:left="397" w:hanging="397"/>
       </w:pPr>
       <w:r>
         <w:rPr>
-          <w:sz w:val="14"/>
+          <w:rFonts w:ascii="Arial" w:hAnsi="Arial" w:eastAsia="Arial"/>
+          <w:sz w:val="24"/>
         </w:rPr>
         <w:t>Ain, N. U., Vaia, G., DeLone, W. H., &amp; Waheed, M. (2019). Two decades of research on business intelligence system adoption, utilization and success: A systematic literature review. Decision Support Systems, 125, 113113. https://doi.org/10.1016/j.dss.2019.113113</w:t>
       </w:r>
     </w:p>
     <w:p>
       <w:pPr>
-        <w:spacing w:after="20" w:line="240" w:lineRule="auto"/>
-        <w:ind w:left="255" w:hanging="255"/>
+        <w:spacing w:after="80" w:line="240" w:lineRule="auto"/>
+        <w:ind w:left="397" w:hanging="397"/>
       </w:pPr>
       <w:r>
         <w:rPr>
-          <w:sz w:val="14"/>
+          <w:rFonts w:ascii="Arial" w:hAnsi="Arial" w:eastAsia="Arial"/>
+          <w:sz w:val="24"/>
         </w:rPr>
-        <w:t>Alam, S., Islam, K. A., Miah, R., Afrin, S., Islam, M. A., Hoque, M. R., &amp; Mahmud, I. (2025). Key success factors of knowledge management systems for optimizing organizational performance: A PRISMA-based systematic literature review. Heliyon, 11(16), e44097. https://doi.org/10.1016/j.heliyon.2025.e44097</w:t>
+        <w:t>Alam, S., Islam, K. A., Miah, R., Afrin, S., Islam, M. A., Hoque, M. R., &amp; Mahmud, I. (2025). Key success factors of knowledge management systems for optimizing organizational performance: A PRISMA-based systematic literature review. Heliyon, 11, e44097. https://doi.org/10.1016/j.heliyon.2025.e44097</w:t>
       </w:r>
     </w:p>
     <w:p>
       <w:pPr>
-        <w:spacing w:after="20" w:line="240" w:lineRule="auto"/>
-        <w:ind w:left="255" w:hanging="255"/>
+        <w:spacing w:after="80" w:line="240" w:lineRule="auto"/>
+        <w:ind w:left="397" w:hanging="397"/>
       </w:pPr>
       <w:r>
         <w:rPr>
-          <w:sz w:val="14"/>
+          <w:rFonts w:ascii="Arial" w:hAnsi="Arial" w:eastAsia="Arial"/>
+          <w:sz w:val="24"/>
         </w:rPr>
         <w:t>Kakhki, M. D., &amp; Gargeya, V. B. (2019). Information systems for supply chain management: A systematic literature analysis. International Journal of Production Research, 57(15–16), 5318–5339. https://doi.org/10.1080/00207543.2019.1570376</w:t>
       </w:r>
     </w:p>
     <w:p>
       <w:pPr>
-        <w:spacing w:after="20" w:line="240" w:lineRule="auto"/>
-        <w:ind w:left="255" w:hanging="255"/>
+        <w:spacing w:after="80" w:line="240" w:lineRule="auto"/>
+        <w:ind w:left="397" w:hanging="397"/>
       </w:pPr>
       <w:r>
         <w:rPr>
-          <w:sz w:val="14"/>
+          <w:rFonts w:ascii="Arial" w:hAnsi="Arial" w:eastAsia="Arial"/>
+          <w:sz w:val="24"/>
         </w:rPr>
-        <w:t>Martins, E. J., &amp; Belfo, F. P. (2023). Major concerns about Enterprise Resource Planning (ERP) systems: A systematic review of a decade of research (2011–2021). Procedia Computer Science, 219, 378–387. https://doi.org/10.1016/j.procs.2023.01.303</w:t>
+        <w:t>Martins, E. J., &amp; Belfo, F. P. (2023). Major concerns about enterprise resource planning (ERP) systems: A systematic review of a decade of research (2011–2021). Procedia Computer Science, 219, 378–387. https://doi.org/10.1016/j.procs.2023.01.303</w:t>
       </w:r>
     </w:p>
     <w:p>
       <w:pPr>
-        <w:spacing w:after="20" w:line="240" w:lineRule="auto"/>
-        <w:ind w:left="255" w:hanging="255"/>
+        <w:spacing w:after="80" w:line="240" w:lineRule="auto"/>
+        <w:ind w:left="397" w:hanging="397"/>
       </w:pPr>
       <w:r>
         <w:rPr>
-          <w:sz w:val="14"/>
+          <w:rFonts w:ascii="Arial" w:hAnsi="Arial" w:eastAsia="Arial"/>
+          <w:sz w:val="24"/>
         </w:rPr>
         <w:t>Soltani, Z., &amp; Jafari Navimipour, N. (2016). Customer relationship management mechanisms: A systematic review of the state of the art literature and recommendations for future research. Computers in Human Behavior, 61, 667–688. https://doi.org/10.1016/j.chb.2016.03.008</w:t>
       </w:r>
     </w:p>
     <w:sectPr>
-      <w:headerReference w:type="default" r:id="rId9"/>
-      <w:footerReference w:type="default" r:id="rId10"/>
       <w:pgSz w:w="12240" w:h="15840"/>
-      <w:pgMar w:top="709" w:right="765" w:bottom="680" w:left="765" w:header="255" w:footer="255" w:gutter="0"/>
+      <w:pgMar w:top="1134" w:right="1134" w:bottom="1134" w:left="1134" w:header="720" w:footer="720" w:gutter="0"/>
       <w:cols w:space="720"/>
       <w:docGrid w:linePitch="360"/>
     </w:sectPr>
   </w:body>
 </w:document>
-</file>
-
-<file path=word/footer1.xml><?xml version="1.0" encoding="utf-8"?>
-<w:ftr xmlns:m="http://schemas.openxmlformats.org/officeDocument/2006/math" xmlns:mc="http://schemas.openxmlformats.org/markup-compatibility/2006" xmlns:mo="http://schemas.microsoft.com/office/mac/office/2008/main" xmlns:mv="urn:schemas-microsoft-com:mac:vml" xmlns:o="urn:schemas-microsoft-com:office:office" xmlns:r="http://schemas.openxmlformats.org/officeDocument/2006/relationships" xmlns:v="urn:schemas-microsoft-com:vml" xmlns:w10="urn:schemas-microsoft-com:office:word" xmlns:w14="http://schemas.microsoft.com/office/word/2010/wordml" xmlns:w="http://schemas.openxmlformats.org/wordprocessingml/2006/main" xmlns:wne="http://schemas.microsoft.com/office/word/2006/wordml" xmlns:wp14="http://schemas.microsoft.com/office/word/2010/wordprocessingDrawing" xmlns:wp="http://schemas.openxmlformats.org/drawingml/2006/wordprocessingDrawing" xmlns:wpc="http://schemas.microsoft.com/office/word/2010/wordprocessingCanvas" xmlns:wpg="http://schemas.microsoft.com/office/word/2010/wordprocessingGroup" xmlns:wpi="http://schemas.microsoft.com/office/word/2010/wordprocessingInk" xmlns:wps="http://schemas.microsoft.com/office/word/2010/wordprocessingShape" mc:Ignorable="w14 wp14">
-  <w:p>
-    <w:pPr>
-      <w:pStyle w:val="Footer"/>
-      <w:jc w:val="center"/>
-    </w:pPr>
-    <w:r>
-      <w:rPr>
-        <w:rFonts w:ascii="Arial" w:hAnsi="Arial"/>
-        <w:color w:val="595959"/>
-        <w:sz w:val="16"/>
-      </w:rPr>
-      <w:t>Grupo 5  •  Sabor &amp; Cia — Alimentos Ltda.</w:t>
-    </w:r>
-  </w:p>
-</w:ftr>
-</file>
-
-<file path=word/header1.xml><?xml version="1.0" encoding="utf-8"?>
-<w:hdr xmlns:m="http://schemas.openxmlformats.org/officeDocument/2006/math" xmlns:mc="http://schemas.openxmlformats.org/markup-compatibility/2006" xmlns:mo="http://schemas.microsoft.com/office/mac/office/2008/main" xmlns:mv="urn:schemas-microsoft-com:mac:vml" xmlns:o="urn:schemas-microsoft-com:office:office" xmlns:r="http://schemas.openxmlformats.org/officeDocument/2006/relationships" xmlns:v="urn:schemas-microsoft-com:vml" xmlns:w10="urn:schemas-microsoft-com:office:word" xmlns:w14="http://schemas.microsoft.com/office/word/2010/wordml" xmlns:w="http://schemas.openxmlformats.org/wordprocessingml/2006/main" xmlns:wne="http://schemas.microsoft.com/office/word/2006/wordml" xmlns:wp14="http://schemas.microsoft.com/office/word/2010/wordprocessingDrawing" xmlns:wp="http://schemas.openxmlformats.org/drawingml/2006/wordprocessingDrawing" xmlns:wpc="http://schemas.microsoft.com/office/word/2010/wordprocessingCanvas" xmlns:wpg="http://schemas.microsoft.com/office/word/2010/wordprocessingGroup" xmlns:wpi="http://schemas.microsoft.com/office/word/2010/wordprocessingInk" xmlns:wps="http://schemas.microsoft.com/office/word/2010/wordprocessingShape" mc:Ignorable="w14 wp14">
-  <w:p>
-    <w:pPr>
-      <w:pStyle w:val="Header"/>
-      <w:jc w:val="center"/>
-    </w:pPr>
-    <w:r>
-      <w:rPr>
-        <w:rFonts w:ascii="Arial" w:hAnsi="Arial"/>
-        <w:color w:val="595959"/>
-        <w:sz w:val="16"/>
-      </w:rPr>
-      <w:t>FGV EAESP  |  Tecnologia, Dados e Negócios  |  Atividade Monitorada 1</w:t>
-    </w:r>
-  </w:p>
-</w:hdr>
 </file>
 
 <file path=word/numbering.xml><?xml version="1.0" encoding="utf-8"?>
@@ -2201,11 +1031,11 @@
     <w:qFormat/>
     <w:rsid w:val="00FC693F"/>
     <w:pPr>
-      <w:spacing w:after="60" w:line="252" w:lineRule="auto"/>
-    </w:pPr>
-    <w:rPr>
-      <w:rFonts w:ascii="Arial" w:hAnsi="Arial"/>
-      <w:sz w:val="18"/>
+      <w:spacing w:line="240" w:lineRule="auto" w:after="80"/>
+    </w:pPr>
+    <w:rPr>
+      <w:rFonts w:ascii="Arial" w:hAnsi="Arial" w:eastAsia="Arial"/>
+      <w:sz w:val="24"/>
     </w:rPr>
   </w:style>
   <w:style w:type="paragraph" w:styleId="Header">
@@ -2222,6 +1052,10 @@
       </w:tabs>
       <w:spacing w:after="0" w:line="240" w:lineRule="auto"/>
     </w:pPr>
+    <w:rPr>
+      <w:rFonts w:ascii="Arial" w:hAnsi="Arial" w:eastAsia="Arial"/>
+      <w:sz w:val="24"/>
+    </w:rPr>
   </w:style>
   <w:style w:type="character" w:customStyle="1" w:styleId="HeaderChar">
     <w:name w:val="Header Char"/>
@@ -2229,6 +1063,10 @@
     <w:link w:val="Header"/>
     <w:uiPriority w:val="99"/>
     <w:rsid w:val="00E618BF"/>
+    <w:rPr>
+      <w:rFonts w:ascii="Arial" w:hAnsi="Arial" w:eastAsia="Arial"/>
+      <w:sz w:val="24"/>
+    </w:rPr>
   </w:style>
   <w:style w:type="paragraph" w:styleId="Footer">
     <w:name w:val="footer"/>
@@ -2244,6 +1082,10 @@
       </w:tabs>
       <w:spacing w:after="0" w:line="240" w:lineRule="auto"/>
     </w:pPr>
+    <w:rPr>
+      <w:rFonts w:ascii="Arial" w:hAnsi="Arial" w:eastAsia="Arial"/>
+      <w:sz w:val="24"/>
+    </w:rPr>
   </w:style>
   <w:style w:type="character" w:customStyle="1" w:styleId="FooterChar">
     <w:name w:val="Footer Char"/>
@@ -2251,6 +1093,10 @@
     <w:link w:val="Footer"/>
     <w:uiPriority w:val="99"/>
     <w:rsid w:val="00E618BF"/>
+    <w:rPr>
+      <w:rFonts w:ascii="Arial" w:hAnsi="Arial" w:eastAsia="Arial"/>
+      <w:sz w:val="24"/>
+    </w:rPr>
   </w:style>
   <w:style w:type="paragraph" w:styleId="Heading1">
     <w:name w:val="heading 1"/>
@@ -2267,11 +1113,11 @@
       <w:outlineLvl w:val="0"/>
     </w:pPr>
     <w:rPr>
-      <w:rFonts w:asciiTheme="majorHAnsi" w:eastAsiaTheme="majorEastAsia" w:hAnsiTheme="majorHAnsi" w:cstheme="majorBidi"/>
+      <w:rFonts w:asciiTheme="majorHAnsi" w:eastAsiaTheme="majorEastAsia" w:hAnsiTheme="majorHAnsi" w:cstheme="majorBidi" w:ascii="Arial" w:hAnsi="Arial" w:eastAsia="Arial"/>
       <w:b/>
       <w:bCs/>
       <w:color w:val="365F91" w:themeColor="accent1" w:themeShade="BF"/>
-      <w:sz w:val="28"/>
+      <w:sz w:val="24"/>
       <w:szCs w:val="28"/>
     </w:rPr>
   </w:style>
@@ -2291,11 +1137,11 @@
       <w:outlineLvl w:val="1"/>
     </w:pPr>
     <w:rPr>
-      <w:rFonts w:asciiTheme="majorHAnsi" w:eastAsiaTheme="majorEastAsia" w:hAnsiTheme="majorHAnsi" w:cstheme="majorBidi"/>
+      <w:rFonts w:asciiTheme="majorHAnsi" w:eastAsiaTheme="majorEastAsia" w:hAnsiTheme="majorHAnsi" w:cstheme="majorBidi" w:ascii="Arial" w:hAnsi="Arial" w:eastAsia="Arial"/>
       <w:b/>
       <w:bCs/>
       <w:color w:val="4F81BD" w:themeColor="accent1"/>
-      <w:sz w:val="26"/>
+      <w:sz w:val="24"/>
       <w:szCs w:val="26"/>
     </w:rPr>
   </w:style>
@@ -2315,10 +1161,11 @@
       <w:outlineLvl w:val="2"/>
     </w:pPr>
     <w:rPr>
-      <w:rFonts w:asciiTheme="majorHAnsi" w:eastAsiaTheme="majorEastAsia" w:hAnsiTheme="majorHAnsi" w:cstheme="majorBidi"/>
+      <w:rFonts w:asciiTheme="majorHAnsi" w:eastAsiaTheme="majorEastAsia" w:hAnsiTheme="majorHAnsi" w:cstheme="majorBidi" w:ascii="Arial" w:hAnsi="Arial" w:eastAsia="Arial"/>
       <w:b/>
       <w:bCs/>
       <w:color w:val="4F81BD" w:themeColor="accent1"/>
+      <w:sz w:val="24"/>
     </w:rPr>
   </w:style>
   <w:style w:type="paragraph" w:styleId="Heading4">
@@ -2338,12 +1185,13 @@
       <w:outlineLvl w:val="3"/>
     </w:pPr>
     <w:rPr>
-      <w:rFonts w:asciiTheme="majorHAnsi" w:eastAsiaTheme="majorEastAsia" w:hAnsiTheme="majorHAnsi" w:cstheme="majorBidi"/>
+      <w:rFonts w:asciiTheme="majorHAnsi" w:eastAsiaTheme="majorEastAsia" w:hAnsiTheme="majorHAnsi" w:cstheme="majorBidi" w:ascii="Arial" w:hAnsi="Arial" w:eastAsia="Arial"/>
       <w:b/>
       <w:bCs/>
       <w:i/>
       <w:iCs/>
       <w:color w:val="4F81BD" w:themeColor="accent1"/>
+      <w:sz w:val="24"/>
     </w:rPr>
   </w:style>
   <w:style w:type="paragraph" w:styleId="Heading5">
@@ -2363,8 +1211,9 @@
       <w:outlineLvl w:val="4"/>
     </w:pPr>
     <w:rPr>
-      <w:rFonts w:asciiTheme="majorHAnsi" w:eastAsiaTheme="majorEastAsia" w:hAnsiTheme="majorHAnsi" w:cstheme="majorBidi"/>
+      <w:rFonts w:asciiTheme="majorHAnsi" w:eastAsiaTheme="majorEastAsia" w:hAnsiTheme="majorHAnsi" w:cstheme="majorBidi" w:ascii="Arial" w:hAnsi="Arial" w:eastAsia="Arial"/>
       <w:color w:val="243F60" w:themeColor="accent1" w:themeShade="7F"/>
+      <w:sz w:val="24"/>
     </w:rPr>
   </w:style>
   <w:style w:type="paragraph" w:styleId="Heading6">
@@ -2384,10 +1233,11 @@
       <w:outlineLvl w:val="5"/>
     </w:pPr>
     <w:rPr>
-      <w:rFonts w:asciiTheme="majorHAnsi" w:eastAsiaTheme="majorEastAsia" w:hAnsiTheme="majorHAnsi" w:cstheme="majorBidi"/>
+      <w:rFonts w:asciiTheme="majorHAnsi" w:eastAsiaTheme="majorEastAsia" w:hAnsiTheme="majorHAnsi" w:cstheme="majorBidi" w:ascii="Arial" w:hAnsi="Arial" w:eastAsia="Arial"/>
       <w:i/>
       <w:iCs/>
       <w:color w:val="243F60" w:themeColor="accent1" w:themeShade="7F"/>
+      <w:sz w:val="24"/>
     </w:rPr>
   </w:style>
   <w:style w:type="paragraph" w:styleId="Heading7">
@@ -2407,10 +1257,11 @@
       <w:outlineLvl w:val="6"/>
     </w:pPr>
     <w:rPr>
-      <w:rFonts w:asciiTheme="majorHAnsi" w:eastAsiaTheme="majorEastAsia" w:hAnsiTheme="majorHAnsi" w:cstheme="majorBidi"/>
+      <w:rFonts w:asciiTheme="majorHAnsi" w:eastAsiaTheme="majorEastAsia" w:hAnsiTheme="majorHAnsi" w:cstheme="majorBidi" w:ascii="Arial" w:hAnsi="Arial" w:eastAsia="Arial"/>
       <w:i/>
       <w:iCs/>
       <w:color w:val="404040" w:themeColor="text1" w:themeTint="BF"/>
+      <w:sz w:val="24"/>
     </w:rPr>
   </w:style>
   <w:style w:type="paragraph" w:styleId="Heading8">
@@ -2430,9 +1281,9 @@
       <w:outlineLvl w:val="7"/>
     </w:pPr>
     <w:rPr>
-      <w:rFonts w:asciiTheme="majorHAnsi" w:eastAsiaTheme="majorEastAsia" w:hAnsiTheme="majorHAnsi" w:cstheme="majorBidi"/>
+      <w:rFonts w:asciiTheme="majorHAnsi" w:eastAsiaTheme="majorEastAsia" w:hAnsiTheme="majorHAnsi" w:cstheme="majorBidi" w:ascii="Arial" w:hAnsi="Arial" w:eastAsia="Arial"/>
       <w:color w:val="4F81BD" w:themeColor="accent1"/>
-      <w:sz w:val="20"/>
+      <w:sz w:val="24"/>
       <w:szCs w:val="20"/>
     </w:rPr>
   </w:style>
@@ -2453,11 +1304,11 @@
       <w:outlineLvl w:val="8"/>
     </w:pPr>
     <w:rPr>
-      <w:rFonts w:asciiTheme="majorHAnsi" w:eastAsiaTheme="majorEastAsia" w:hAnsiTheme="majorHAnsi" w:cstheme="majorBidi"/>
+      <w:rFonts w:asciiTheme="majorHAnsi" w:eastAsiaTheme="majorEastAsia" w:hAnsiTheme="majorHAnsi" w:cstheme="majorBidi" w:ascii="Arial" w:hAnsi="Arial" w:eastAsia="Arial"/>
       <w:i/>
       <w:iCs/>
       <w:color w:val="404040" w:themeColor="text1" w:themeTint="BF"/>
-      <w:sz w:val="20"/>
+      <w:sz w:val="24"/>
       <w:szCs w:val="20"/>
     </w:rPr>
   </w:style>
@@ -2466,12 +1317,20 @@
     <w:uiPriority w:val="1"/>
     <w:semiHidden/>
     <w:unhideWhenUsed/>
+    <w:rPr>
+      <w:rFonts w:ascii="Arial" w:hAnsi="Arial" w:eastAsia="Arial"/>
+      <w:sz w:val="24"/>
+    </w:rPr>
   </w:style>
   <w:style w:type="table" w:default="1" w:styleId="TableNormal">
     <w:name w:val="Normal Table"/>
     <w:uiPriority w:val="99"/>
     <w:semiHidden/>
     <w:unhideWhenUsed/>
+    <w:rPr>
+      <w:rFonts w:ascii="Arial" w:hAnsi="Arial" w:eastAsia="Arial"/>
+      <w:sz w:val="24"/>
+    </w:rPr>
     <w:tblPr>
       <w:tblInd w:w="0" w:type="dxa"/>
       <w:tblCellMar>
@@ -2496,6 +1355,10 @@
     <w:pPr>
       <w:spacing w:after="0" w:line="240" w:lineRule="auto"/>
     </w:pPr>
+    <w:rPr>
+      <w:rFonts w:ascii="Arial" w:hAnsi="Arial" w:eastAsia="Arial"/>
+      <w:sz w:val="24"/>
+    </w:rPr>
   </w:style>
   <w:style w:type="character" w:customStyle="1" w:styleId="Heading1Char">
     <w:name w:val="Heading 1 Char"/>
@@ -2504,11 +1367,11 @@
     <w:uiPriority w:val="9"/>
     <w:rsid w:val="00FC693F"/>
     <w:rPr>
-      <w:rFonts w:asciiTheme="majorHAnsi" w:eastAsiaTheme="majorEastAsia" w:hAnsiTheme="majorHAnsi" w:cstheme="majorBidi"/>
+      <w:rFonts w:asciiTheme="majorHAnsi" w:eastAsiaTheme="majorEastAsia" w:hAnsiTheme="majorHAnsi" w:cstheme="majorBidi" w:ascii="Arial" w:hAnsi="Arial" w:eastAsia="Arial"/>
       <w:b/>
       <w:bCs/>
       <w:color w:val="365F91" w:themeColor="accent1" w:themeShade="BF"/>
-      <w:sz w:val="28"/>
+      <w:sz w:val="24"/>
       <w:szCs w:val="28"/>
     </w:rPr>
   </w:style>
@@ -2519,11 +1382,11 @@
     <w:uiPriority w:val="9"/>
     <w:rsid w:val="00FC693F"/>
     <w:rPr>
-      <w:rFonts w:asciiTheme="majorHAnsi" w:eastAsiaTheme="majorEastAsia" w:hAnsiTheme="majorHAnsi" w:cstheme="majorBidi"/>
+      <w:rFonts w:asciiTheme="majorHAnsi" w:eastAsiaTheme="majorEastAsia" w:hAnsiTheme="majorHAnsi" w:cstheme="majorBidi" w:ascii="Arial" w:hAnsi="Arial" w:eastAsia="Arial"/>
       <w:b/>
       <w:bCs/>
       <w:color w:val="4F81BD" w:themeColor="accent1"/>
-      <w:sz w:val="26"/>
+      <w:sz w:val="24"/>
       <w:szCs w:val="26"/>
     </w:rPr>
   </w:style>
@@ -2534,10 +1397,11 @@
     <w:uiPriority w:val="9"/>
     <w:rsid w:val="00FC693F"/>
     <w:rPr>
-      <w:rFonts w:asciiTheme="majorHAnsi" w:eastAsiaTheme="majorEastAsia" w:hAnsiTheme="majorHAnsi" w:cstheme="majorBidi"/>
+      <w:rFonts w:asciiTheme="majorHAnsi" w:eastAsiaTheme="majorEastAsia" w:hAnsiTheme="majorHAnsi" w:cstheme="majorBidi" w:ascii="Arial" w:hAnsi="Arial" w:eastAsia="Arial"/>
       <w:b/>
       <w:bCs/>
       <w:color w:val="4F81BD" w:themeColor="accent1"/>
+      <w:sz w:val="24"/>
     </w:rPr>
   </w:style>
   <w:style w:type="paragraph" w:styleId="Title">
@@ -2556,11 +1420,11 @@
       <w:contextualSpacing/>
     </w:pPr>
     <w:rPr>
-      <w:rFonts w:asciiTheme="majorHAnsi" w:eastAsiaTheme="majorEastAsia" w:hAnsiTheme="majorHAnsi" w:cstheme="majorBidi" w:ascii="Arial" w:hAnsi="Arial"/>
+      <w:rFonts w:asciiTheme="majorHAnsi" w:eastAsiaTheme="majorEastAsia" w:hAnsiTheme="majorHAnsi" w:cstheme="majorBidi" w:ascii="Arial" w:hAnsi="Arial" w:eastAsia="Arial"/>
       <w:color w:val="17365D" w:themeColor="text2" w:themeShade="BF"/>
       <w:spacing w:val="5"/>
       <w:kern w:val="28"/>
-      <w:sz w:val="52"/>
+      <w:sz w:val="24"/>
       <w:szCs w:val="52"/>
     </w:rPr>
   </w:style>
@@ -2571,11 +1435,11 @@
     <w:uiPriority w:val="10"/>
     <w:rsid w:val="00FC693F"/>
     <w:rPr>
-      <w:rFonts w:asciiTheme="majorHAnsi" w:eastAsiaTheme="majorEastAsia" w:hAnsiTheme="majorHAnsi" w:cstheme="majorBidi"/>
+      <w:rFonts w:asciiTheme="majorHAnsi" w:eastAsiaTheme="majorEastAsia" w:hAnsiTheme="majorHAnsi" w:cstheme="majorBidi" w:ascii="Arial" w:hAnsi="Arial" w:eastAsia="Arial"/>
       <w:color w:val="17365D" w:themeColor="text2" w:themeShade="BF"/>
       <w:spacing w:val="5"/>
       <w:kern w:val="28"/>
-      <w:sz w:val="52"/>
+      <w:sz w:val="24"/>
       <w:szCs w:val="52"/>
     </w:rPr>
   </w:style>
@@ -2593,7 +1457,7 @@
       </w:numPr>
     </w:pPr>
     <w:rPr>
-      <w:rFonts w:asciiTheme="majorHAnsi" w:eastAsiaTheme="majorEastAsia" w:hAnsiTheme="majorHAnsi" w:cstheme="majorBidi" w:ascii="Arial" w:hAnsi="Arial"/>
+      <w:rFonts w:asciiTheme="majorHAnsi" w:eastAsiaTheme="majorEastAsia" w:hAnsiTheme="majorHAnsi" w:cstheme="majorBidi" w:ascii="Arial" w:hAnsi="Arial" w:eastAsia="Arial"/>
       <w:i/>
       <w:iCs/>
       <w:color w:val="4F81BD" w:themeColor="accent1"/>
@@ -2609,7 +1473,7 @@
     <w:uiPriority w:val="11"/>
     <w:rsid w:val="00FC693F"/>
     <w:rPr>
-      <w:rFonts w:asciiTheme="majorHAnsi" w:eastAsiaTheme="majorEastAsia" w:hAnsiTheme="majorHAnsi" w:cstheme="majorBidi"/>
+      <w:rFonts w:asciiTheme="majorHAnsi" w:eastAsiaTheme="majorEastAsia" w:hAnsiTheme="majorHAnsi" w:cstheme="majorBidi" w:ascii="Arial" w:hAnsi="Arial" w:eastAsia="Arial"/>
       <w:i/>
       <w:iCs/>
       <w:color w:val="4F81BD" w:themeColor="accent1"/>
@@ -2628,6 +1492,10 @@
       <w:ind w:left="720"/>
       <w:contextualSpacing/>
     </w:pPr>
+    <w:rPr>
+      <w:rFonts w:ascii="Arial" w:hAnsi="Arial" w:eastAsia="Arial"/>
+      <w:sz w:val="24"/>
+    </w:rPr>
   </w:style>
   <w:style w:type="paragraph" w:styleId="BodyText">
     <w:name w:val="Body Text"/>
@@ -2639,6 +1507,10 @@
     <w:pPr>
       <w:spacing w:after="120"/>
     </w:pPr>
+    <w:rPr>
+      <w:rFonts w:ascii="Arial" w:hAnsi="Arial" w:eastAsia="Arial"/>
+      <w:sz w:val="24"/>
+    </w:rPr>
   </w:style>
   <w:style w:type="character" w:customStyle="1" w:styleId="BodyTextChar">
     <w:name w:val="Body Text Char"/>
@@ -2646,6 +1518,10 @@
     <w:link w:val="BodyText"/>
     <w:uiPriority w:val="99"/>
     <w:rsid w:val="00AA1D8D"/>
+    <w:rPr>
+      <w:rFonts w:ascii="Arial" w:hAnsi="Arial" w:eastAsia="Arial"/>
+      <w:sz w:val="24"/>
+    </w:rPr>
   </w:style>
   <w:style w:type="paragraph" w:styleId="BodyText2">
     <w:name w:val="Body Text 2"/>
@@ -2657,6 +1533,10 @@
     <w:pPr>
       <w:spacing w:after="120" w:line="480" w:lineRule="auto"/>
     </w:pPr>
+    <w:rPr>
+      <w:rFonts w:ascii="Arial" w:hAnsi="Arial" w:eastAsia="Arial"/>
+      <w:sz w:val="24"/>
+    </w:rPr>
   </w:style>
   <w:style w:type="character" w:customStyle="1" w:styleId="BodyText2Char">
     <w:name w:val="Body Text 2 Char"/>
@@ -2664,6 +1544,10 @@
     <w:link w:val="BodyText2"/>
     <w:uiPriority w:val="99"/>
     <w:rsid w:val="00AA1D8D"/>
+    <w:rPr>
+      <w:rFonts w:ascii="Arial" w:hAnsi="Arial" w:eastAsia="Arial"/>
+      <w:sz w:val="24"/>
+    </w:rPr>
   </w:style>
   <w:style w:type="paragraph" w:styleId="BodyText3">
     <w:name w:val="Body Text 3"/>
@@ -2676,7 +1560,8 @@
       <w:spacing w:after="120"/>
     </w:pPr>
     <w:rPr>
-      <w:sz w:val="16"/>
+      <w:rFonts w:ascii="Arial" w:hAnsi="Arial" w:eastAsia="Arial"/>
+      <w:sz w:val="24"/>
       <w:szCs w:val="16"/>
     </w:rPr>
   </w:style>
@@ -2687,7 +1572,8 @@
     <w:uiPriority w:val="99"/>
     <w:rsid w:val="00AA1D8D"/>
     <w:rPr>
-      <w:sz w:val="16"/>
+      <w:rFonts w:ascii="Arial" w:hAnsi="Arial" w:eastAsia="Arial"/>
+      <w:sz w:val="24"/>
       <w:szCs w:val="16"/>
     </w:rPr>
   </w:style>
@@ -2701,6 +1587,10 @@
       <w:ind w:left="360" w:hanging="360"/>
       <w:contextualSpacing/>
     </w:pPr>
+    <w:rPr>
+      <w:rFonts w:ascii="Arial" w:hAnsi="Arial" w:eastAsia="Arial"/>
+      <w:sz w:val="24"/>
+    </w:rPr>
   </w:style>
   <w:style w:type="paragraph" w:styleId="List2">
     <w:name w:val="List 2"/>
@@ -2712,6 +1602,10 @@
       <w:ind w:left="720" w:hanging="360"/>
       <w:contextualSpacing/>
     </w:pPr>
+    <w:rPr>
+      <w:rFonts w:ascii="Arial" w:hAnsi="Arial" w:eastAsia="Arial"/>
+      <w:sz w:val="24"/>
+    </w:rPr>
   </w:style>
   <w:style w:type="paragraph" w:styleId="List3">
     <w:name w:val="List 3"/>
@@ -2723,6 +1617,10 @@
       <w:ind w:left="1080" w:hanging="360"/>
       <w:contextualSpacing/>
     </w:pPr>
+    <w:rPr>
+      <w:rFonts w:ascii="Arial" w:hAnsi="Arial" w:eastAsia="Arial"/>
+      <w:sz w:val="24"/>
+    </w:rPr>
   </w:style>
   <w:style w:type="paragraph" w:styleId="ListBullet">
     <w:name w:val="List Bullet"/>
@@ -2736,6 +1634,10 @@
       </w:numPr>
       <w:contextualSpacing/>
     </w:pPr>
+    <w:rPr>
+      <w:rFonts w:ascii="Arial" w:hAnsi="Arial" w:eastAsia="Arial"/>
+      <w:sz w:val="24"/>
+    </w:rPr>
   </w:style>
   <w:style w:type="paragraph" w:styleId="ListBullet2">
     <w:name w:val="List Bullet 2"/>
@@ -2749,6 +1651,10 @@
       </w:numPr>
       <w:contextualSpacing/>
     </w:pPr>
+    <w:rPr>
+      <w:rFonts w:ascii="Arial" w:hAnsi="Arial" w:eastAsia="Arial"/>
+      <w:sz w:val="24"/>
+    </w:rPr>
   </w:style>
   <w:style w:type="paragraph" w:styleId="ListBullet3">
     <w:name w:val="List Bullet 3"/>
@@ -2762,6 +1668,10 @@
       </w:numPr>
       <w:contextualSpacing/>
     </w:pPr>
+    <w:rPr>
+      <w:rFonts w:ascii="Arial" w:hAnsi="Arial" w:eastAsia="Arial"/>
+      <w:sz w:val="24"/>
+    </w:rPr>
   </w:style>
   <w:style w:type="paragraph" w:styleId="ListNumber">
     <w:name w:val="List Number"/>
@@ -2775,6 +1685,10 @@
       </w:numPr>
       <w:contextualSpacing/>
     </w:pPr>
+    <w:rPr>
+      <w:rFonts w:ascii="Arial" w:hAnsi="Arial" w:eastAsia="Arial"/>
+      <w:sz w:val="24"/>
+    </w:rPr>
   </w:style>
   <w:style w:type="paragraph" w:styleId="ListNumber2">
     <w:name w:val="List Number 2"/>
@@ -2788,6 +1702,10 @@
       </w:numPr>
       <w:contextualSpacing/>
     </w:pPr>
+    <w:rPr>
+      <w:rFonts w:ascii="Arial" w:hAnsi="Arial" w:eastAsia="Arial"/>
+      <w:sz w:val="24"/>
+    </w:rPr>
   </w:style>
   <w:style w:type="paragraph" w:styleId="ListNumber3">
     <w:name w:val="List Number 3"/>
@@ -2801,6 +1719,10 @@
       </w:numPr>
       <w:contextualSpacing/>
     </w:pPr>
+    <w:rPr>
+      <w:rFonts w:ascii="Arial" w:hAnsi="Arial" w:eastAsia="Arial"/>
+      <w:sz w:val="24"/>
+    </w:rPr>
   </w:style>
   <w:style w:type="paragraph" w:styleId="ListContinue">
     <w:name w:val="List Continue"/>
@@ -2813,6 +1735,10 @@
       <w:ind w:left="360"/>
       <w:contextualSpacing/>
     </w:pPr>
+    <w:rPr>
+      <w:rFonts w:ascii="Arial" w:hAnsi="Arial" w:eastAsia="Arial"/>
+      <w:sz w:val="24"/>
+    </w:rPr>
   </w:style>
   <w:style w:type="paragraph" w:styleId="ListContinue2">
     <w:name w:val="List Continue 2"/>
@@ -2825,6 +1751,10 @@
       <w:ind w:left="720"/>
       <w:contextualSpacing/>
     </w:pPr>
+    <w:rPr>
+      <w:rFonts w:ascii="Arial" w:hAnsi="Arial" w:eastAsia="Arial"/>
+      <w:sz w:val="24"/>
+    </w:rPr>
   </w:style>
   <w:style w:type="paragraph" w:styleId="ListContinue3">
     <w:name w:val="List Continue 3"/>
@@ -2837,6 +1767,10 @@
       <w:ind w:left="1080"/>
       <w:contextualSpacing/>
     </w:pPr>
+    <w:rPr>
+      <w:rFonts w:ascii="Arial" w:hAnsi="Arial" w:eastAsia="Arial"/>
+      <w:sz w:val="24"/>
+    </w:rPr>
   </w:style>
   <w:style w:type="paragraph" w:styleId="MacroText">
     <w:name w:val="macro"/>
@@ -2856,8 +1790,8 @@
       </w:tabs>
     </w:pPr>
     <w:rPr>
-      <w:rFonts w:ascii="Courier" w:hAnsi="Courier"/>
-      <w:sz w:val="20"/>
+      <w:rFonts w:ascii="Arial" w:hAnsi="Arial" w:eastAsia="Arial"/>
+      <w:sz w:val="24"/>
       <w:szCs w:val="20"/>
     </w:rPr>
   </w:style>
@@ -2868,8 +1802,8 @@
     <w:uiPriority w:val="99"/>
     <w:rsid w:val="0029639D"/>
     <w:rPr>
-      <w:rFonts w:ascii="Courier" w:hAnsi="Courier"/>
-      <w:sz w:val="20"/>
+      <w:rFonts w:ascii="Arial" w:hAnsi="Arial" w:eastAsia="Arial"/>
+      <w:sz w:val="24"/>
       <w:szCs w:val="20"/>
     </w:rPr>
   </w:style>
@@ -2882,9 +1816,11 @@
     <w:qFormat/>
     <w:rsid w:val="00FC693F"/>
     <w:rPr>
+      <w:rFonts w:ascii="Arial" w:hAnsi="Arial" w:eastAsia="Arial"/>
       <w:i/>
       <w:iCs/>
       <w:color w:val="000000" w:themeColor="text1"/>
+      <w:sz w:val="24"/>
     </w:rPr>
   </w:style>
   <w:style w:type="character" w:customStyle="1" w:styleId="QuoteChar">
@@ -2894,9 +1830,11 @@
     <w:uiPriority w:val="29"/>
     <w:rsid w:val="00FC693F"/>
     <w:rPr>
+      <w:rFonts w:ascii="Arial" w:hAnsi="Arial" w:eastAsia="Arial"/>
       <w:i/>
       <w:iCs/>
       <w:color w:val="000000" w:themeColor="text1"/>
+      <w:sz w:val="24"/>
     </w:rPr>
   </w:style>
   <w:style w:type="character" w:customStyle="1" w:styleId="Heading4Char">
@@ -2907,12 +1845,13 @@
     <w:semiHidden/>
     <w:rsid w:val="00FC693F"/>
     <w:rPr>
-      <w:rFonts w:asciiTheme="majorHAnsi" w:eastAsiaTheme="majorEastAsia" w:hAnsiTheme="majorHAnsi" w:cstheme="majorBidi"/>
+      <w:rFonts w:asciiTheme="majorHAnsi" w:eastAsiaTheme="majorEastAsia" w:hAnsiTheme="majorHAnsi" w:cstheme="majorBidi" w:ascii="Arial" w:hAnsi="Arial" w:eastAsia="Arial"/>
       <w:b/>
       <w:bCs/>
       <w:i/>
       <w:iCs/>
       <w:color w:val="4F81BD" w:themeColor="accent1"/>
+      <w:sz w:val="24"/>
     </w:rPr>
   </w:style>
   <w:style w:type="character" w:customStyle="1" w:styleId="Heading5Char">
@@ -2923,8 +1862,9 @@
     <w:semiHidden/>
     <w:rsid w:val="00FC693F"/>
     <w:rPr>
-      <w:rFonts w:asciiTheme="majorHAnsi" w:eastAsiaTheme="majorEastAsia" w:hAnsiTheme="majorHAnsi" w:cstheme="majorBidi"/>
+      <w:rFonts w:asciiTheme="majorHAnsi" w:eastAsiaTheme="majorEastAsia" w:hAnsiTheme="majorHAnsi" w:cstheme="majorBidi" w:ascii="Arial" w:hAnsi="Arial" w:eastAsia="Arial"/>
       <w:color w:val="243F60" w:themeColor="accent1" w:themeShade="7F"/>
+      <w:sz w:val="24"/>
     </w:rPr>
   </w:style>
   <w:style w:type="character" w:customStyle="1" w:styleId="Heading6Char">
@@ -2935,10 +1875,11 @@
     <w:semiHidden/>
     <w:rsid w:val="00FC693F"/>
     <w:rPr>
-      <w:rFonts w:asciiTheme="majorHAnsi" w:eastAsiaTheme="majorEastAsia" w:hAnsiTheme="majorHAnsi" w:cstheme="majorBidi"/>
+      <w:rFonts w:asciiTheme="majorHAnsi" w:eastAsiaTheme="majorEastAsia" w:hAnsiTheme="majorHAnsi" w:cstheme="majorBidi" w:ascii="Arial" w:hAnsi="Arial" w:eastAsia="Arial"/>
       <w:i/>
       <w:iCs/>
       <w:color w:val="243F60" w:themeColor="accent1" w:themeShade="7F"/>
+      <w:sz w:val="24"/>
     </w:rPr>
   </w:style>
   <w:style w:type="character" w:customStyle="1" w:styleId="Heading7Char">
@@ -2949,10 +1890,11 @@
     <w:semiHidden/>
     <w:rsid w:val="00FC693F"/>
     <w:rPr>
-      <w:rFonts w:asciiTheme="majorHAnsi" w:eastAsiaTheme="majorEastAsia" w:hAnsiTheme="majorHAnsi" w:cstheme="majorBidi"/>
+      <w:rFonts w:asciiTheme="majorHAnsi" w:eastAsiaTheme="majorEastAsia" w:hAnsiTheme="majorHAnsi" w:cstheme="majorBidi" w:ascii="Arial" w:hAnsi="Arial" w:eastAsia="Arial"/>
       <w:i/>
       <w:iCs/>
       <w:color w:val="404040" w:themeColor="text1" w:themeTint="BF"/>
+      <w:sz w:val="24"/>
     </w:rPr>
   </w:style>
   <w:style w:type="character" w:customStyle="1" w:styleId="Heading8Char">
@@ -2963,9 +1905,9 @@
     <w:semiHidden/>
     <w:rsid w:val="00FC693F"/>
     <w:rPr>
-      <w:rFonts w:asciiTheme="majorHAnsi" w:eastAsiaTheme="majorEastAsia" w:hAnsiTheme="majorHAnsi" w:cstheme="majorBidi"/>
+      <w:rFonts w:asciiTheme="majorHAnsi" w:eastAsiaTheme="majorEastAsia" w:hAnsiTheme="majorHAnsi" w:cstheme="majorBidi" w:ascii="Arial" w:hAnsi="Arial" w:eastAsia="Arial"/>
       <w:color w:val="4F81BD" w:themeColor="accent1"/>
-      <w:sz w:val="20"/>
+      <w:sz w:val="24"/>
       <w:szCs w:val="20"/>
     </w:rPr>
   </w:style>
@@ -2977,11 +1919,11 @@
     <w:semiHidden/>
     <w:rsid w:val="00FC693F"/>
     <w:rPr>
-      <w:rFonts w:asciiTheme="majorHAnsi" w:eastAsiaTheme="majorEastAsia" w:hAnsiTheme="majorHAnsi" w:cstheme="majorBidi"/>
+      <w:rFonts w:asciiTheme="majorHAnsi" w:eastAsiaTheme="majorEastAsia" w:hAnsiTheme="majorHAnsi" w:cstheme="majorBidi" w:ascii="Arial" w:hAnsi="Arial" w:eastAsia="Arial"/>
       <w:i/>
       <w:iCs/>
       <w:color w:val="404040" w:themeColor="text1" w:themeTint="BF"/>
-      <w:sz w:val="20"/>
+      <w:sz w:val="24"/>
       <w:szCs w:val="20"/>
     </w:rPr>
   </w:style>
@@ -2998,10 +1940,11 @@
       <w:spacing w:line="240" w:lineRule="auto"/>
     </w:pPr>
     <w:rPr>
+      <w:rFonts w:ascii="Arial" w:hAnsi="Arial" w:eastAsia="Arial"/>
       <w:b/>
       <w:bCs/>
       <w:color w:val="4F81BD" w:themeColor="accent1"/>
-      <w:sz w:val="18"/>
+      <w:sz w:val="24"/>
       <w:szCs w:val="18"/>
     </w:rPr>
   </w:style>
@@ -3012,8 +1955,10 @@
     <w:qFormat/>
     <w:rsid w:val="00FC693F"/>
     <w:rPr>
+      <w:rFonts w:ascii="Arial" w:hAnsi="Arial" w:eastAsia="Arial"/>
       <w:b/>
       <w:bCs/>
+      <w:sz w:val="24"/>
     </w:rPr>
   </w:style>
   <w:style w:type="character" w:styleId="Emphasis">
@@ -3023,8 +1968,10 @@
     <w:qFormat/>
     <w:rsid w:val="00FC693F"/>
     <w:rPr>
+      <w:rFonts w:ascii="Arial" w:hAnsi="Arial" w:eastAsia="Arial"/>
       <w:i/>
       <w:iCs/>
+      <w:sz w:val="24"/>
     </w:rPr>
   </w:style>
   <w:style w:type="paragraph" w:styleId="IntenseQuote">
@@ -3043,11 +1990,13 @@
       <w:ind w:left="936" w:right="936"/>
     </w:pPr>
     <w:rPr>
+      <w:rFonts w:ascii="Arial" w:hAnsi="Arial" w:eastAsia="Arial"/>
       <w:b/>
       <w:bCs/>
       <w:i/>
       <w:iCs/>
       <w:color w:val="4F81BD" w:themeColor="accent1"/>
+      <w:sz w:val="24"/>
     </w:rPr>
   </w:style>
   <w:style w:type="character" w:customStyle="1" w:styleId="IntenseQuoteChar">
@@ -3057,11 +2006,13 @@
     <w:uiPriority w:val="30"/>
     <w:rsid w:val="00FC693F"/>
     <w:rPr>
+      <w:rFonts w:ascii="Arial" w:hAnsi="Arial" w:eastAsia="Arial"/>
       <w:b/>
       <w:bCs/>
       <w:i/>
       <w:iCs/>
       <w:color w:val="4F81BD" w:themeColor="accent1"/>
+      <w:sz w:val="24"/>
     </w:rPr>
   </w:style>
   <w:style w:type="character" w:styleId="SubtleEmphasis">
@@ -3071,9 +2022,11 @@
     <w:qFormat/>
     <w:rsid w:val="00FC693F"/>
     <w:rPr>
+      <w:rFonts w:ascii="Arial" w:hAnsi="Arial" w:eastAsia="Arial"/>
       <w:i/>
       <w:iCs/>
       <w:color w:val="808080" w:themeColor="text1" w:themeTint="7F"/>
+      <w:sz w:val="24"/>
     </w:rPr>
   </w:style>
   <w:style w:type="character" w:styleId="IntenseEmphasis">
@@ -3083,11 +2036,13 @@
     <w:qFormat/>
     <w:rsid w:val="00FC693F"/>
     <w:rPr>
+      <w:rFonts w:ascii="Arial" w:hAnsi="Arial" w:eastAsia="Arial"/>
       <w:b/>
       <w:bCs/>
       <w:i/>
       <w:iCs/>
       <w:color w:val="4F81BD" w:themeColor="accent1"/>
+      <w:sz w:val="24"/>
     </w:rPr>
   </w:style>
   <w:style w:type="character" w:styleId="SubtleReference">
@@ -3097,8 +2052,10 @@
     <w:qFormat/>
     <w:rsid w:val="00FC693F"/>
     <w:rPr>
+      <w:rFonts w:ascii="Arial" w:hAnsi="Arial" w:eastAsia="Arial"/>
       <w:smallCaps/>
       <w:color w:val="C0504D" w:themeColor="accent2"/>
+      <w:sz w:val="24"/>
       <w:u w:val="single"/>
     </w:rPr>
   </w:style>
@@ -3109,11 +2066,13 @@
     <w:qFormat/>
     <w:rsid w:val="00FC693F"/>
     <w:rPr>
+      <w:rFonts w:ascii="Arial" w:hAnsi="Arial" w:eastAsia="Arial"/>
       <w:b/>
       <w:bCs/>
       <w:smallCaps/>
       <w:color w:val="C0504D" w:themeColor="accent2"/>
       <w:spacing w:val="5"/>
+      <w:sz w:val="24"/>
       <w:u w:val="single"/>
     </w:rPr>
   </w:style>
@@ -3124,10 +2083,12 @@
     <w:qFormat/>
     <w:rsid w:val="00FC693F"/>
     <w:rPr>
+      <w:rFonts w:ascii="Arial" w:hAnsi="Arial" w:eastAsia="Arial"/>
       <w:b/>
       <w:bCs/>
       <w:smallCaps/>
       <w:spacing w:val="5"/>
+      <w:sz w:val="24"/>
     </w:rPr>
   </w:style>
   <w:style w:type="paragraph" w:styleId="TOCHeading">
@@ -3142,6 +2103,10 @@
     <w:pPr>
       <w:outlineLvl w:val="9"/>
     </w:pPr>
+    <w:rPr>
+      <w:rFonts w:ascii="Arial" w:hAnsi="Arial" w:eastAsia="Arial"/>
+      <w:sz w:val="24"/>
+    </w:rPr>
   </w:style>
   <w:style w:type="table" w:styleId="TableGrid">
     <w:name w:val="Table Grid"/>
@@ -3151,6 +2116,10 @@
     <w:pPr>
       <w:spacing w:after="0" w:line="240" w:lineRule="auto"/>
     </w:pPr>
+    <w:rPr>
+      <w:rFonts w:ascii="Arial" w:hAnsi="Arial" w:eastAsia="Arial"/>
+      <w:sz w:val="24"/>
+    </w:rPr>
     <w:tblPr>
       <w:tblInd w:w="0" w:type="dxa"/>
       <w:tblBorders>
@@ -3178,7 +2147,9 @@
       <w:spacing w:after="0" w:line="240" w:lineRule="auto"/>
     </w:pPr>
     <w:rPr>
+      <w:rFonts w:ascii="Arial" w:hAnsi="Arial" w:eastAsia="Arial"/>
       <w:color w:val="000000" w:themeColor="text1" w:themeShade="BF"/>
+      <w:sz w:val="24"/>
     </w:rPr>
     <w:tblPr>
       <w:tblStyleRowBandSize w:val="1"/>
@@ -3281,7 +2252,9 @@
       <w:spacing w:after="0" w:line="240" w:lineRule="auto"/>
     </w:pPr>
     <w:rPr>
+      <w:rFonts w:ascii="Arial" w:hAnsi="Arial" w:eastAsia="Arial"/>
       <w:color w:val="365F91" w:themeColor="accent1" w:themeShade="BF"/>
+      <w:sz w:val="24"/>
     </w:rPr>
     <w:tblPr>
       <w:tblStyleRowBandSize w:val="1"/>
@@ -3384,7 +2357,9 @@
       <w:spacing w:after="0" w:line="240" w:lineRule="auto"/>
     </w:pPr>
     <w:rPr>
+      <w:rFonts w:ascii="Arial" w:hAnsi="Arial" w:eastAsia="Arial"/>
       <w:color w:val="943634" w:themeColor="accent2" w:themeShade="BF"/>
+      <w:sz w:val="24"/>
     </w:rPr>
     <w:tblPr>
       <w:tblStyleRowBandSize w:val="1"/>
@@ -3487,7 +2462,9 @@
       <w:spacing w:after="0" w:line="240" w:lineRule="auto"/>
     </w:pPr>
     <w:rPr>
+      <w:rFonts w:ascii="Arial" w:hAnsi="Arial" w:eastAsia="Arial"/>
       <w:color w:val="76923C" w:themeColor="accent3" w:themeShade="BF"/>
+      <w:sz w:val="24"/>
     </w:rPr>
     <w:tblPr>
       <w:tblStyleRowBandSize w:val="1"/>
@@ -3590,7 +2567,9 @@
       <w:spacing w:after="0" w:line="240" w:lineRule="auto"/>
     </w:pPr>
     <w:rPr>
+      <w:rFonts w:ascii="Arial" w:hAnsi="Arial" w:eastAsia="Arial"/>
       <w:color w:val="5F497A" w:themeColor="accent4" w:themeShade="BF"/>
+      <w:sz w:val="24"/>
     </w:rPr>
     <w:tblPr>
       <w:tblStyleRowBandSize w:val="1"/>
@@ -3693,7 +2672,9 @@
       <w:spacing w:after="0" w:line="240" w:lineRule="auto"/>
     </w:pPr>
     <w:rPr>
+      <w:rFonts w:ascii="Arial" w:hAnsi="Arial" w:eastAsia="Arial"/>
       <w:color w:val="31849B" w:themeColor="accent5" w:themeShade="BF"/>
+      <w:sz w:val="24"/>
     </w:rPr>
     <w:tblPr>
       <w:tblStyleRowBandSize w:val="1"/>
@@ -3796,7 +2777,9 @@
       <w:spacing w:after="0" w:line="240" w:lineRule="auto"/>
     </w:pPr>
     <w:rPr>
+      <w:rFonts w:ascii="Arial" w:hAnsi="Arial" w:eastAsia="Arial"/>
       <w:color w:val="E36C0A" w:themeColor="accent6" w:themeShade="BF"/>
+      <w:sz w:val="24"/>
     </w:rPr>
     <w:tblPr>
       <w:tblStyleRowBandSize w:val="1"/>
@@ -3898,6 +2881,10 @@
     <w:pPr>
       <w:spacing w:after="0" w:line="240" w:lineRule="auto"/>
     </w:pPr>
+    <w:rPr>
+      <w:rFonts w:ascii="Arial" w:hAnsi="Arial" w:eastAsia="Arial"/>
+      <w:sz w:val="24"/>
+    </w:rPr>
     <w:tblPr>
       <w:tblStyleRowBandSize w:val="1"/>
       <w:tblStyleColBandSize w:val="1"/>
@@ -3990,6 +2977,10 @@
     <w:pPr>
       <w:spacing w:after="0" w:line="240" w:lineRule="auto"/>
     </w:pPr>
+    <w:rPr>
+      <w:rFonts w:ascii="Arial" w:hAnsi="Arial" w:eastAsia="Arial"/>
+      <w:sz w:val="24"/>
+    </w:rPr>
     <w:tblPr>
       <w:tblStyleRowBandSize w:val="1"/>
       <w:tblStyleColBandSize w:val="1"/>
@@ -4082,6 +3073,10 @@
     <w:pPr>
       <w:spacing w:after="0" w:line="240" w:lineRule="auto"/>
     </w:pPr>
+    <w:rPr>
+      <w:rFonts w:ascii="Arial" w:hAnsi="Arial" w:eastAsia="Arial"/>
+      <w:sz w:val="24"/>
+    </w:rPr>
     <w:tblPr>
       <w:tblStyleRowBandSize w:val="1"/>
       <w:tblStyleColBandSize w:val="1"/>
@@ -4174,6 +3169,10 @@
     <w:pPr>
       <w:spacing w:after="0" w:line="240" w:lineRule="auto"/>
     </w:pPr>
+    <w:rPr>
+      <w:rFonts w:ascii="Arial" w:hAnsi="Arial" w:eastAsia="Arial"/>
+      <w:sz w:val="24"/>
+    </w:rPr>
     <w:tblPr>
       <w:tblStyleRowBandSize w:val="1"/>
       <w:tblStyleColBandSize w:val="1"/>
@@ -4266,6 +3265,10 @@
     <w:pPr>
       <w:spacing w:after="0" w:line="240" w:lineRule="auto"/>
     </w:pPr>
+    <w:rPr>
+      <w:rFonts w:ascii="Arial" w:hAnsi="Arial" w:eastAsia="Arial"/>
+      <w:sz w:val="24"/>
+    </w:rPr>
     <w:tblPr>
       <w:tblStyleRowBandSize w:val="1"/>
       <w:tblStyleColBandSize w:val="1"/>
@@ -4358,6 +3361,10 @@
     <w:pPr>
       <w:spacing w:after="0" w:line="240" w:lineRule="auto"/>
     </w:pPr>
+    <w:rPr>
+      <w:rFonts w:ascii="Arial" w:hAnsi="Arial" w:eastAsia="Arial"/>
+      <w:sz w:val="24"/>
+    </w:rPr>
     <w:tblPr>
       <w:tblStyleRowBandSize w:val="1"/>
       <w:tblStyleColBandSize w:val="1"/>
@@ -4450,6 +3457,10 @@
     <w:pPr>
       <w:spacing w:after="0" w:line="240" w:lineRule="auto"/>
     </w:pPr>
+    <w:rPr>
+      <w:rFonts w:ascii="Arial" w:hAnsi="Arial" w:eastAsia="Arial"/>
+      <w:sz w:val="24"/>
+    </w:rPr>
     <w:tblPr>
       <w:tblStyleRowBandSize w:val="1"/>
       <w:tblStyleColBandSize w:val="1"/>
@@ -4542,6 +3553,10 @@
     <w:pPr>
       <w:spacing w:after="0" w:line="240" w:lineRule="auto"/>
     </w:pPr>
+    <w:rPr>
+      <w:rFonts w:ascii="Arial" w:hAnsi="Arial" w:eastAsia="Arial"/>
+      <w:sz w:val="24"/>
+    </w:rPr>
     <w:tblPr>
       <w:tblStyleRowBandSize w:val="1"/>
       <w:tblStyleColBandSize w:val="1"/>
@@ -4672,6 +3687,10 @@
     <w:pPr>
       <w:spacing w:after="0" w:line="240" w:lineRule="auto"/>
     </w:pPr>
+    <w:rPr>
+      <w:rFonts w:ascii="Arial" w:hAnsi="Arial" w:eastAsia="Arial"/>
+      <w:sz w:val="24"/>
+    </w:rPr>
     <w:tblPr>
       <w:tblStyleRowBandSize w:val="1"/>
       <w:tblStyleColBandSize w:val="1"/>
@@ -4802,6 +3821,10 @@
     <w:pPr>
       <w:spacing w:after="0" w:line="240" w:lineRule="auto"/>
     </w:pPr>
+    <w:rPr>
+      <w:rFonts w:ascii="Arial" w:hAnsi="Arial" w:eastAsia="Arial"/>
+      <w:sz w:val="24"/>
+    </w:rPr>
     <w:tblPr>
       <w:tblStyleRowBandSize w:val="1"/>
       <w:tblStyleColBandSize w:val="1"/>
@@ -4932,6 +3955,10 @@
     <w:pPr>
       <w:spacing w:after="0" w:line="240" w:lineRule="auto"/>
     </w:pPr>
+    <w:rPr>
+      <w:rFonts w:ascii="Arial" w:hAnsi="Arial" w:eastAsia="Arial"/>
+      <w:sz w:val="24"/>
+    </w:rPr>
     <w:tblPr>
       <w:tblStyleRowBandSize w:val="1"/>
       <w:tblStyleColBandSize w:val="1"/>
@@ -5062,6 +4089,10 @@
     <w:pPr>
       <w:spacing w:after="0" w:line="240" w:lineRule="auto"/>
     </w:pPr>
+    <w:rPr>
+      <w:rFonts w:ascii="Arial" w:hAnsi="Arial" w:eastAsia="Arial"/>
+      <w:sz w:val="24"/>
+    </w:rPr>
     <w:tblPr>
       <w:tblStyleRowBandSize w:val="1"/>
       <w:tblStyleColBandSize w:val="1"/>
@@ -5192,6 +4223,10 @@
     <w:pPr>
       <w:spacing w:after="0" w:line="240" w:lineRule="auto"/>
     </w:pPr>
+    <w:rPr>
+      <w:rFonts w:ascii="Arial" w:hAnsi="Arial" w:eastAsia="Arial"/>
+      <w:sz w:val="24"/>
+    </w:rPr>
     <w:tblPr>
       <w:tblStyleRowBandSize w:val="1"/>
       <w:tblStyleColBandSize w:val="1"/>
@@ -5322,6 +4357,10 @@
     <w:pPr>
       <w:spacing w:after="0" w:line="240" w:lineRule="auto"/>
     </w:pPr>
+    <w:rPr>
+      <w:rFonts w:ascii="Arial" w:hAnsi="Arial" w:eastAsia="Arial"/>
+      <w:sz w:val="24"/>
+    </w:rPr>
     <w:tblPr>
       <w:tblStyleRowBandSize w:val="1"/>
       <w:tblStyleColBandSize w:val="1"/>
@@ -5452,6 +4491,10 @@
     <w:pPr>
       <w:spacing w:after="0" w:line="240" w:lineRule="auto"/>
     </w:pPr>
+    <w:rPr>
+      <w:rFonts w:ascii="Arial" w:hAnsi="Arial" w:eastAsia="Arial"/>
+      <w:sz w:val="24"/>
+    </w:rPr>
     <w:tblPr>
       <w:tblStyleRowBandSize w:val="1"/>
       <w:tblStyleColBandSize w:val="1"/>
@@ -5558,6 +4601,10 @@
     <w:pPr>
       <w:spacing w:after="0" w:line="240" w:lineRule="auto"/>
     </w:pPr>
+    <w:rPr>
+      <w:rFonts w:ascii="Arial" w:hAnsi="Arial" w:eastAsia="Arial"/>
+      <w:sz w:val="24"/>
+    </w:rPr>
     <w:tblPr>
       <w:tblStyleRowBandSize w:val="1"/>
       <w:tblStyleColBandSize w:val="1"/>
@@ -5664,6 +4711,10 @@
     <w:pPr>
       <w:spacing w:after="0" w:line="240" w:lineRule="auto"/>
     </w:pPr>
+    <w:rPr>
+      <w:rFonts w:ascii="Arial" w:hAnsi="Arial" w:eastAsia="Arial"/>
+      <w:sz w:val="24"/>
+    </w:rPr>
     <w:tblPr>
       <w:tblStyleRowBandSize w:val="1"/>
       <w:tblStyleColBandSize w:val="1"/>
@@ -5770,6 +4821,10 @@
     <w:pPr>
       <w:spacing w:after="0" w:line="240" w:lineRule="auto"/>
     </w:pPr>
+    <w:rPr>
+      <w:rFonts w:ascii="Arial" w:hAnsi="Arial" w:eastAsia="Arial"/>
+      <w:sz w:val="24"/>
+    </w:rPr>
     <w:tblPr>
       <w:tblStyleRowBandSize w:val="1"/>
       <w:tblStyleColBandSize w:val="1"/>
@@ -5876,6 +4931,10 @@
     <w:pPr>
       <w:spacing w:after="0" w:line="240" w:lineRule="auto"/>
     </w:pPr>
+    <w:rPr>
+      <w:rFonts w:ascii="Arial" w:hAnsi="Arial" w:eastAsia="Arial"/>
+      <w:sz w:val="24"/>
+    </w:rPr>
     <w:tblPr>
       <w:tblStyleRowBandSize w:val="1"/>
       <w:tblStyleColBandSize w:val="1"/>
@@ -5982,6 +5041,10 @@
     <w:pPr>
       <w:spacing w:after="0" w:line="240" w:lineRule="auto"/>
     </w:pPr>
+    <w:rPr>
+      <w:rFonts w:ascii="Arial" w:hAnsi="Arial" w:eastAsia="Arial"/>
+      <w:sz w:val="24"/>
+    </w:rPr>
     <w:tblPr>
       <w:tblStyleRowBandSize w:val="1"/>
       <w:tblStyleColBandSize w:val="1"/>
@@ -6088,6 +5151,10 @@
     <w:pPr>
       <w:spacing w:after="0" w:line="240" w:lineRule="auto"/>
     </w:pPr>
+    <w:rPr>
+      <w:rFonts w:ascii="Arial" w:hAnsi="Arial" w:eastAsia="Arial"/>
+      <w:sz w:val="24"/>
+    </w:rPr>
     <w:tblPr>
       <w:tblStyleRowBandSize w:val="1"/>
       <w:tblStyleColBandSize w:val="1"/>
@@ -6194,6 +5261,10 @@
     <w:pPr>
       <w:spacing w:after="0" w:line="240" w:lineRule="auto"/>
     </w:pPr>
+    <w:rPr>
+      <w:rFonts w:ascii="Arial" w:hAnsi="Arial" w:eastAsia="Arial"/>
+      <w:sz w:val="24"/>
+    </w:rPr>
     <w:tblPr>
       <w:tblStyleRowBandSize w:val="1"/>
       <w:tblStyleColBandSize w:val="1"/>
@@ -6343,6 +5414,10 @@
     <w:pPr>
       <w:spacing w:after="0" w:line="240" w:lineRule="auto"/>
     </w:pPr>
+    <w:rPr>
+      <w:rFonts w:ascii="Arial" w:hAnsi="Arial" w:eastAsia="Arial"/>
+      <w:sz w:val="24"/>
+    </w:rPr>
     <w:tblPr>
       <w:tblStyleRowBandSize w:val="1"/>
       <w:tblStyleColBandSize w:val="1"/>
@@ -6492,6 +5567,10 @@
     <w:pPr>
       <w:spacing w:after="0" w:line="240" w:lineRule="auto"/>
     </w:pPr>
+    <w:rPr>
+      <w:rFonts w:ascii="Arial" w:hAnsi="Arial" w:eastAsia="Arial"/>
+      <w:sz w:val="24"/>
+    </w:rPr>
     <w:tblPr>
       <w:tblStyleRowBandSize w:val="1"/>
       <w:tblStyleColBandSize w:val="1"/>
@@ -6641,6 +5720,10 @@
     <w:pPr>
       <w:spacing w:after="0" w:line="240" w:lineRule="auto"/>
     </w:pPr>
+    <w:rPr>
+      <w:rFonts w:ascii="Arial" w:hAnsi="Arial" w:eastAsia="Arial"/>
+      <w:sz w:val="24"/>
+    </w:rPr>
     <w:tblPr>
       <w:tblStyleRowBandSize w:val="1"/>
       <w:tblStyleColBandSize w:val="1"/>
@@ -6790,6 +5873,10 @@
     <w:pPr>
       <w:spacing w:after="0" w:line="240" w:lineRule="auto"/>
     </w:pPr>
+    <w:rPr>
+      <w:rFonts w:ascii="Arial" w:hAnsi="Arial" w:eastAsia="Arial"/>
+      <w:sz w:val="24"/>
+    </w:rPr>
     <w:tblPr>
       <w:tblStyleRowBandSize w:val="1"/>
       <w:tblStyleColBandSize w:val="1"/>
@@ -6939,6 +6026,10 @@
     <w:pPr>
       <w:spacing w:after="0" w:line="240" w:lineRule="auto"/>
     </w:pPr>
+    <w:rPr>
+      <w:rFonts w:ascii="Arial" w:hAnsi="Arial" w:eastAsia="Arial"/>
+      <w:sz w:val="24"/>
+    </w:rPr>
     <w:tblPr>
       <w:tblStyleRowBandSize w:val="1"/>
       <w:tblStyleColBandSize w:val="1"/>
@@ -7088,6 +6179,10 @@
     <w:pPr>
       <w:spacing w:after="0" w:line="240" w:lineRule="auto"/>
     </w:pPr>
+    <w:rPr>
+      <w:rFonts w:ascii="Arial" w:hAnsi="Arial" w:eastAsia="Arial"/>
+      <w:sz w:val="24"/>
+    </w:rPr>
     <w:tblPr>
       <w:tblStyleRowBandSize w:val="1"/>
       <w:tblStyleColBandSize w:val="1"/>
@@ -7238,7 +6333,9 @@
       <w:spacing w:after="0" w:line="240" w:lineRule="auto"/>
     </w:pPr>
     <w:rPr>
+      <w:rFonts w:ascii="Arial" w:hAnsi="Arial" w:eastAsia="Arial"/>
       <w:color w:val="000000" w:themeColor="text1"/>
+      <w:sz w:val="24"/>
     </w:rPr>
     <w:tblPr>
       <w:tblStyleRowBandSize w:val="1"/>
@@ -7322,7 +6419,9 @@
       <w:spacing w:after="0" w:line="240" w:lineRule="auto"/>
     </w:pPr>
     <w:rPr>
+      <w:rFonts w:ascii="Arial" w:hAnsi="Arial" w:eastAsia="Arial"/>
       <w:color w:val="000000" w:themeColor="text1"/>
+      <w:sz w:val="24"/>
     </w:rPr>
     <w:tblPr>
       <w:tblStyleRowBandSize w:val="1"/>
@@ -7406,7 +6505,9 @@
       <w:spacing w:after="0" w:line="240" w:lineRule="auto"/>
     </w:pPr>
     <w:rPr>
+      <w:rFonts w:ascii="Arial" w:hAnsi="Arial" w:eastAsia="Arial"/>
       <w:color w:val="000000" w:themeColor="text1"/>
+      <w:sz w:val="24"/>
     </w:rPr>
     <w:tblPr>
       <w:tblStyleRowBandSize w:val="1"/>
@@ -7490,7 +6591,9 @@
       <w:spacing w:after="0" w:line="240" w:lineRule="auto"/>
     </w:pPr>
     <w:rPr>
+      <w:rFonts w:ascii="Arial" w:hAnsi="Arial" w:eastAsia="Arial"/>
       <w:color w:val="000000" w:themeColor="text1"/>
+      <w:sz w:val="24"/>
     </w:rPr>
     <w:tblPr>
       <w:tblStyleRowBandSize w:val="1"/>
@@ -7574,7 +6677,9 @@
       <w:spacing w:after="0" w:line="240" w:lineRule="auto"/>
     </w:pPr>
     <w:rPr>
+      <w:rFonts w:ascii="Arial" w:hAnsi="Arial" w:eastAsia="Arial"/>
       <w:color w:val="000000" w:themeColor="text1"/>
+      <w:sz w:val="24"/>
     </w:rPr>
     <w:tblPr>
       <w:tblStyleRowBandSize w:val="1"/>
@@ -7658,7 +6763,9 @@
       <w:spacing w:after="0" w:line="240" w:lineRule="auto"/>
     </w:pPr>
     <w:rPr>
+      <w:rFonts w:ascii="Arial" w:hAnsi="Arial" w:eastAsia="Arial"/>
       <w:color w:val="000000" w:themeColor="text1"/>
+      <w:sz w:val="24"/>
     </w:rPr>
     <w:tblPr>
       <w:tblStyleRowBandSize w:val="1"/>
@@ -7742,7 +6849,9 @@
       <w:spacing w:after="0" w:line="240" w:lineRule="auto"/>
     </w:pPr>
     <w:rPr>
+      <w:rFonts w:ascii="Arial" w:hAnsi="Arial" w:eastAsia="Arial"/>
       <w:color w:val="000000" w:themeColor="text1"/>
+      <w:sz w:val="24"/>
     </w:rPr>
     <w:tblPr>
       <w:tblStyleRowBandSize w:val="1"/>
@@ -7826,8 +6935,9 @@
       <w:spacing w:after="0" w:line="240" w:lineRule="auto"/>
     </w:pPr>
     <w:rPr>
-      <w:rFonts w:asciiTheme="majorHAnsi" w:eastAsiaTheme="majorEastAsia" w:hAnsiTheme="majorHAnsi" w:cstheme="majorBidi"/>
+      <w:rFonts w:asciiTheme="majorHAnsi" w:eastAsiaTheme="majorEastAsia" w:hAnsiTheme="majorHAnsi" w:cstheme="majorBidi" w:ascii="Arial" w:hAnsi="Arial" w:eastAsia="Arial"/>
       <w:color w:val="000000" w:themeColor="text1"/>
+      <w:sz w:val="24"/>
     </w:rPr>
     <w:tblPr>
       <w:tblStyleRowBandSize w:val="1"/>
@@ -7954,8 +7064,9 @@
       <w:spacing w:after="0" w:line="240" w:lineRule="auto"/>
     </w:pPr>
     <w:rPr>
-      <w:rFonts w:asciiTheme="majorHAnsi" w:eastAsiaTheme="majorEastAsia" w:hAnsiTheme="majorHAnsi" w:cstheme="majorBidi"/>
+      <w:rFonts w:asciiTheme="majorHAnsi" w:eastAsiaTheme="majorEastAsia" w:hAnsiTheme="majorHAnsi" w:cstheme="majorBidi" w:ascii="Arial" w:hAnsi="Arial" w:eastAsia="Arial"/>
       <w:color w:val="000000" w:themeColor="text1"/>
+      <w:sz w:val="24"/>
     </w:rPr>
     <w:tblPr>
       <w:tblStyleRowBandSize w:val="1"/>
@@ -8082,8 +7193,9 @@
       <w:spacing w:after="0" w:line="240" w:lineRule="auto"/>
     </w:pPr>
     <w:rPr>
-      <w:rFonts w:asciiTheme="majorHAnsi" w:eastAsiaTheme="majorEastAsia" w:hAnsiTheme="majorHAnsi" w:cstheme="majorBidi"/>
+      <w:rFonts w:asciiTheme="majorHAnsi" w:eastAsiaTheme="majorEastAsia" w:hAnsiTheme="majorHAnsi" w:cstheme="majorBidi" w:ascii="Arial" w:hAnsi="Arial" w:eastAsia="Arial"/>
       <w:color w:val="000000" w:themeColor="text1"/>
+      <w:sz w:val="24"/>
     </w:rPr>
     <w:tblPr>
       <w:tblStyleRowBandSize w:val="1"/>
@@ -8210,8 +7322,9 @@
       <w:spacing w:after="0" w:line="240" w:lineRule="auto"/>
     </w:pPr>
     <w:rPr>
-      <w:rFonts w:asciiTheme="majorHAnsi" w:eastAsiaTheme="majorEastAsia" w:hAnsiTheme="majorHAnsi" w:cstheme="majorBidi"/>
+      <w:rFonts w:asciiTheme="majorHAnsi" w:eastAsiaTheme="majorEastAsia" w:hAnsiTheme="majorHAnsi" w:cstheme="majorBidi" w:ascii="Arial" w:hAnsi="Arial" w:eastAsia="Arial"/>
       <w:color w:val="000000" w:themeColor="text1"/>
+      <w:sz w:val="24"/>
     </w:rPr>
     <w:tblPr>
       <w:tblStyleRowBandSize w:val="1"/>
@@ -8338,8 +7451,9 @@
       <w:spacing w:after="0" w:line="240" w:lineRule="auto"/>
     </w:pPr>
     <w:rPr>
-      <w:rFonts w:asciiTheme="majorHAnsi" w:eastAsiaTheme="majorEastAsia" w:hAnsiTheme="majorHAnsi" w:cstheme="majorBidi"/>
+      <w:rFonts w:asciiTheme="majorHAnsi" w:eastAsiaTheme="majorEastAsia" w:hAnsiTheme="majorHAnsi" w:cstheme="majorBidi" w:ascii="Arial" w:hAnsi="Arial" w:eastAsia="Arial"/>
       <w:color w:val="000000" w:themeColor="text1"/>
+      <w:sz w:val="24"/>
     </w:rPr>
     <w:tblPr>
       <w:tblStyleRowBandSize w:val="1"/>
@@ -8466,8 +7580,9 @@
       <w:spacing w:after="0" w:line="240" w:lineRule="auto"/>
     </w:pPr>
     <w:rPr>
-      <w:rFonts w:asciiTheme="majorHAnsi" w:eastAsiaTheme="majorEastAsia" w:hAnsiTheme="majorHAnsi" w:cstheme="majorBidi"/>
+      <w:rFonts w:asciiTheme="majorHAnsi" w:eastAsiaTheme="majorEastAsia" w:hAnsiTheme="majorHAnsi" w:cstheme="majorBidi" w:ascii="Arial" w:hAnsi="Arial" w:eastAsia="Arial"/>
       <w:color w:val="000000" w:themeColor="text1"/>
+      <w:sz w:val="24"/>
     </w:rPr>
     <w:tblPr>
       <w:tblStyleRowBandSize w:val="1"/>
@@ -8594,8 +7709,9 @@
       <w:spacing w:after="0" w:line="240" w:lineRule="auto"/>
     </w:pPr>
     <w:rPr>
-      <w:rFonts w:asciiTheme="majorHAnsi" w:eastAsiaTheme="majorEastAsia" w:hAnsiTheme="majorHAnsi" w:cstheme="majorBidi"/>
+      <w:rFonts w:asciiTheme="majorHAnsi" w:eastAsiaTheme="majorEastAsia" w:hAnsiTheme="majorHAnsi" w:cstheme="majorBidi" w:ascii="Arial" w:hAnsi="Arial" w:eastAsia="Arial"/>
       <w:color w:val="000000" w:themeColor="text1"/>
+      <w:sz w:val="24"/>
     </w:rPr>
     <w:tblPr>
       <w:tblStyleRowBandSize w:val="1"/>
@@ -8721,6 +7837,10 @@
     <w:pPr>
       <w:spacing w:after="0" w:line="240" w:lineRule="auto"/>
     </w:pPr>
+    <w:rPr>
+      <w:rFonts w:ascii="Arial" w:hAnsi="Arial" w:eastAsia="Arial"/>
+      <w:sz w:val="24"/>
+    </w:rPr>
     <w:tblPr>
       <w:tblStyleRowBandSize w:val="1"/>
       <w:tblStyleColBandSize w:val="1"/>
@@ -8794,6 +7914,10 @@
     <w:pPr>
       <w:spacing w:after="0" w:line="240" w:lineRule="auto"/>
     </w:pPr>
+    <w:rPr>
+      <w:rFonts w:ascii="Arial" w:hAnsi="Arial" w:eastAsia="Arial"/>
+      <w:sz w:val="24"/>
+    </w:rPr>
     <w:tblPr>
       <w:tblStyleRowBandSize w:val="1"/>
       <w:tblStyleColBandSize w:val="1"/>
@@ -8867,6 +7991,10 @@
     <w:pPr>
       <w:spacing w:after="0" w:line="240" w:lineRule="auto"/>
     </w:pPr>
+    <w:rPr>
+      <w:rFonts w:ascii="Arial" w:hAnsi="Arial" w:eastAsia="Arial"/>
+      <w:sz w:val="24"/>
+    </w:rPr>
     <w:tblPr>
       <w:tblStyleRowBandSize w:val="1"/>
       <w:tblStyleColBandSize w:val="1"/>
@@ -8940,6 +8068,10 @@
     <w:pPr>
       <w:spacing w:after="0" w:line="240" w:lineRule="auto"/>
     </w:pPr>
+    <w:rPr>
+      <w:rFonts w:ascii="Arial" w:hAnsi="Arial" w:eastAsia="Arial"/>
+      <w:sz w:val="24"/>
+    </w:rPr>
     <w:tblPr>
       <w:tblStyleRowBandSize w:val="1"/>
       <w:tblStyleColBandSize w:val="1"/>
@@ -9013,6 +8145,10 @@
     <w:pPr>
       <w:spacing w:after="0" w:line="240" w:lineRule="auto"/>
     </w:pPr>
+    <w:rPr>
+      <w:rFonts w:ascii="Arial" w:hAnsi="Arial" w:eastAsia="Arial"/>
+      <w:sz w:val="24"/>
+    </w:rPr>
     <w:tblPr>
       <w:tblStyleRowBandSize w:val="1"/>
       <w:tblStyleColBandSize w:val="1"/>
@@ -9086,6 +8222,10 @@
     <w:pPr>
       <w:spacing w:after="0" w:line="240" w:lineRule="auto"/>
     </w:pPr>
+    <w:rPr>
+      <w:rFonts w:ascii="Arial" w:hAnsi="Arial" w:eastAsia="Arial"/>
+      <w:sz w:val="24"/>
+    </w:rPr>
     <w:tblPr>
       <w:tblStyleRowBandSize w:val="1"/>
       <w:tblStyleColBandSize w:val="1"/>
@@ -9159,6 +8299,10 @@
     <w:pPr>
       <w:spacing w:after="0" w:line="240" w:lineRule="auto"/>
     </w:pPr>
+    <w:rPr>
+      <w:rFonts w:ascii="Arial" w:hAnsi="Arial" w:eastAsia="Arial"/>
+      <w:sz w:val="24"/>
+    </w:rPr>
     <w:tblPr>
       <w:tblStyleRowBandSize w:val="1"/>
       <w:tblStyleColBandSize w:val="1"/>
@@ -9233,8 +8377,9 @@
       <w:spacing w:after="0" w:line="240" w:lineRule="auto"/>
     </w:pPr>
     <w:rPr>
-      <w:rFonts w:asciiTheme="majorHAnsi" w:eastAsiaTheme="majorEastAsia" w:hAnsiTheme="majorHAnsi" w:cstheme="majorBidi"/>
+      <w:rFonts w:asciiTheme="majorHAnsi" w:eastAsiaTheme="majorEastAsia" w:hAnsiTheme="majorHAnsi" w:cstheme="majorBidi" w:ascii="Arial" w:hAnsi="Arial" w:eastAsia="Arial"/>
       <w:color w:val="000000" w:themeColor="text1"/>
+      <w:sz w:val="24"/>
     </w:rPr>
     <w:tblPr>
       <w:tblStyleRowBandSize w:val="1"/>
@@ -9358,8 +8503,9 @@
       <w:spacing w:after="0" w:line="240" w:lineRule="auto"/>
     </w:pPr>
     <w:rPr>
-      <w:rFonts w:asciiTheme="majorHAnsi" w:eastAsiaTheme="majorEastAsia" w:hAnsiTheme="majorHAnsi" w:cstheme="majorBidi"/>
+      <w:rFonts w:asciiTheme="majorHAnsi" w:eastAsiaTheme="majorEastAsia" w:hAnsiTheme="majorHAnsi" w:cstheme="majorBidi" w:ascii="Arial" w:hAnsi="Arial" w:eastAsia="Arial"/>
       <w:color w:val="000000" w:themeColor="text1"/>
+      <w:sz w:val="24"/>
     </w:rPr>
     <w:tblPr>
       <w:tblStyleRowBandSize w:val="1"/>
@@ -9483,8 +8629,9 @@
       <w:spacing w:after="0" w:line="240" w:lineRule="auto"/>
     </w:pPr>
     <w:rPr>
-      <w:rFonts w:asciiTheme="majorHAnsi" w:eastAsiaTheme="majorEastAsia" w:hAnsiTheme="majorHAnsi" w:cstheme="majorBidi"/>
+      <w:rFonts w:asciiTheme="majorHAnsi" w:eastAsiaTheme="majorEastAsia" w:hAnsiTheme="majorHAnsi" w:cstheme="majorBidi" w:ascii="Arial" w:hAnsi="Arial" w:eastAsia="Arial"/>
       <w:color w:val="000000" w:themeColor="text1"/>
+      <w:sz w:val="24"/>
     </w:rPr>
     <w:tblPr>
       <w:tblStyleRowBandSize w:val="1"/>
@@ -9608,8 +8755,9 @@
       <w:spacing w:after="0" w:line="240" w:lineRule="auto"/>
     </w:pPr>
     <w:rPr>
-      <w:rFonts w:asciiTheme="majorHAnsi" w:eastAsiaTheme="majorEastAsia" w:hAnsiTheme="majorHAnsi" w:cstheme="majorBidi"/>
+      <w:rFonts w:asciiTheme="majorHAnsi" w:eastAsiaTheme="majorEastAsia" w:hAnsiTheme="majorHAnsi" w:cstheme="majorBidi" w:ascii="Arial" w:hAnsi="Arial" w:eastAsia="Arial"/>
       <w:color w:val="000000" w:themeColor="text1"/>
+      <w:sz w:val="24"/>
     </w:rPr>
     <w:tblPr>
       <w:tblStyleRowBandSize w:val="1"/>
@@ -9733,8 +8881,9 @@
       <w:spacing w:after="0" w:line="240" w:lineRule="auto"/>
     </w:pPr>
     <w:rPr>
-      <w:rFonts w:asciiTheme="majorHAnsi" w:eastAsiaTheme="majorEastAsia" w:hAnsiTheme="majorHAnsi" w:cstheme="majorBidi"/>
+      <w:rFonts w:asciiTheme="majorHAnsi" w:eastAsiaTheme="majorEastAsia" w:hAnsiTheme="majorHAnsi" w:cstheme="majorBidi" w:ascii="Arial" w:hAnsi="Arial" w:eastAsia="Arial"/>
       <w:color w:val="000000" w:themeColor="text1"/>
+      <w:sz w:val="24"/>
     </w:rPr>
     <w:tblPr>
       <w:tblStyleRowBandSize w:val="1"/>
@@ -9858,8 +9007,9 @@
       <w:spacing w:after="0" w:line="240" w:lineRule="auto"/>
     </w:pPr>
     <w:rPr>
-      <w:rFonts w:asciiTheme="majorHAnsi" w:eastAsiaTheme="majorEastAsia" w:hAnsiTheme="majorHAnsi" w:cstheme="majorBidi"/>
+      <w:rFonts w:asciiTheme="majorHAnsi" w:eastAsiaTheme="majorEastAsia" w:hAnsiTheme="majorHAnsi" w:cstheme="majorBidi" w:ascii="Arial" w:hAnsi="Arial" w:eastAsia="Arial"/>
       <w:color w:val="000000" w:themeColor="text1"/>
+      <w:sz w:val="24"/>
     </w:rPr>
     <w:tblPr>
       <w:tblStyleRowBandSize w:val="1"/>
@@ -9983,8 +9133,9 @@
       <w:spacing w:after="0" w:line="240" w:lineRule="auto"/>
     </w:pPr>
     <w:rPr>
-      <w:rFonts w:asciiTheme="majorHAnsi" w:eastAsiaTheme="majorEastAsia" w:hAnsiTheme="majorHAnsi" w:cstheme="majorBidi"/>
+      <w:rFonts w:asciiTheme="majorHAnsi" w:eastAsiaTheme="majorEastAsia" w:hAnsiTheme="majorHAnsi" w:cstheme="majorBidi" w:ascii="Arial" w:hAnsi="Arial" w:eastAsia="Arial"/>
       <w:color w:val="000000" w:themeColor="text1"/>
+      <w:sz w:val="24"/>
     </w:rPr>
     <w:tblPr>
       <w:tblStyleRowBandSize w:val="1"/>
@@ -10107,6 +9258,10 @@
     <w:pPr>
       <w:spacing w:after="0" w:line="240" w:lineRule="auto"/>
     </w:pPr>
+    <w:rPr>
+      <w:rFonts w:ascii="Arial" w:hAnsi="Arial" w:eastAsia="Arial"/>
+      <w:sz w:val="24"/>
+    </w:rPr>
     <w:tblPr>
       <w:tblStyleRowBandSize w:val="1"/>
       <w:tblStyleColBandSize w:val="1"/>
@@ -10248,6 +9403,10 @@
     <w:pPr>
       <w:spacing w:after="0" w:line="240" w:lineRule="auto"/>
     </w:pPr>
+    <w:rPr>
+      <w:rFonts w:ascii="Arial" w:hAnsi="Arial" w:eastAsia="Arial"/>
+      <w:sz w:val="24"/>
+    </w:rPr>
     <w:tblPr>
       <w:tblStyleRowBandSize w:val="1"/>
       <w:tblStyleColBandSize w:val="1"/>
@@ -10389,6 +9548,10 @@
     <w:pPr>
       <w:spacing w:after="0" w:line="240" w:lineRule="auto"/>
     </w:pPr>
+    <w:rPr>
+      <w:rFonts w:ascii="Arial" w:hAnsi="Arial" w:eastAsia="Arial"/>
+      <w:sz w:val="24"/>
+    </w:rPr>
     <w:tblPr>
       <w:tblStyleRowBandSize w:val="1"/>
       <w:tblStyleColBandSize w:val="1"/>
@@ -10530,6 +9693,10 @@
     <w:pPr>
       <w:spacing w:after="0" w:line="240" w:lineRule="auto"/>
     </w:pPr>
+    <w:rPr>
+      <w:rFonts w:ascii="Arial" w:hAnsi="Arial" w:eastAsia="Arial"/>
+      <w:sz w:val="24"/>
+    </w:rPr>
     <w:tblPr>
       <w:tblStyleRowBandSize w:val="1"/>
       <w:tblStyleColBandSize w:val="1"/>
@@ -10671,6 +9838,10 @@
     <w:pPr>
       <w:spacing w:after="0" w:line="240" w:lineRule="auto"/>
     </w:pPr>
+    <w:rPr>
+      <w:rFonts w:ascii="Arial" w:hAnsi="Arial" w:eastAsia="Arial"/>
+      <w:sz w:val="24"/>
+    </w:rPr>
     <w:tblPr>
       <w:tblStyleRowBandSize w:val="1"/>
       <w:tblStyleColBandSize w:val="1"/>
@@ -10812,6 +9983,10 @@
     <w:pPr>
       <w:spacing w:after="0" w:line="240" w:lineRule="auto"/>
     </w:pPr>
+    <w:rPr>
+      <w:rFonts w:ascii="Arial" w:hAnsi="Arial" w:eastAsia="Arial"/>
+      <w:sz w:val="24"/>
+    </w:rPr>
     <w:tblPr>
       <w:tblStyleRowBandSize w:val="1"/>
       <w:tblStyleColBandSize w:val="1"/>
@@ -10953,6 +10128,10 @@
     <w:pPr>
       <w:spacing w:after="0" w:line="240" w:lineRule="auto"/>
     </w:pPr>
+    <w:rPr>
+      <w:rFonts w:ascii="Arial" w:hAnsi="Arial" w:eastAsia="Arial"/>
+      <w:sz w:val="24"/>
+    </w:rPr>
     <w:tblPr>
       <w:tblStyleRowBandSize w:val="1"/>
       <w:tblStyleColBandSize w:val="1"/>
@@ -11095,7 +10274,9 @@
       <w:spacing w:after="0" w:line="240" w:lineRule="auto"/>
     </w:pPr>
     <w:rPr>
+      <w:rFonts w:ascii="Arial" w:hAnsi="Arial" w:eastAsia="Arial"/>
       <w:color w:val="FFFFFF" w:themeColor="background1"/>
+      <w:sz w:val="24"/>
     </w:rPr>
     <w:tblPr>
       <w:tblStyleRowBandSize w:val="1"/>
@@ -11209,7 +10390,9 @@
       <w:spacing w:after="0" w:line="240" w:lineRule="auto"/>
     </w:pPr>
     <w:rPr>
+      <w:rFonts w:ascii="Arial" w:hAnsi="Arial" w:eastAsia="Arial"/>
       <w:color w:val="FFFFFF" w:themeColor="background1"/>
+      <w:sz w:val="24"/>
     </w:rPr>
     <w:tblPr>
       <w:tblStyleRowBandSize w:val="1"/>
@@ -11323,7 +10506,9 @@
       <w:spacing w:after="0" w:line="240" w:lineRule="auto"/>
     </w:pPr>
     <w:rPr>
+      <w:rFonts w:ascii="Arial" w:hAnsi="Arial" w:eastAsia="Arial"/>
       <w:color w:val="FFFFFF" w:themeColor="background1"/>
+      <w:sz w:val="24"/>
     </w:rPr>
     <w:tblPr>
       <w:tblStyleRowBandSize w:val="1"/>
@@ -11437,7 +10622,9 @@
       <w:spacing w:after="0" w:line="240" w:lineRule="auto"/>
     </w:pPr>
     <w:rPr>
+      <w:rFonts w:ascii="Arial" w:hAnsi="Arial" w:eastAsia="Arial"/>
       <w:color w:val="FFFFFF" w:themeColor="background1"/>
+      <w:sz w:val="24"/>
     </w:rPr>
     <w:tblPr>
       <w:tblStyleRowBandSize w:val="1"/>
@@ -11551,7 +10738,9 @@
       <w:spacing w:after="0" w:line="240" w:lineRule="auto"/>
     </w:pPr>
     <w:rPr>
+      <w:rFonts w:ascii="Arial" w:hAnsi="Arial" w:eastAsia="Arial"/>
       <w:color w:val="FFFFFF" w:themeColor="background1"/>
+      <w:sz w:val="24"/>
     </w:rPr>
     <w:tblPr>
       <w:tblStyleRowBandSize w:val="1"/>
@@ -11665,7 +10854,9 @@
       <w:spacing w:after="0" w:line="240" w:lineRule="auto"/>
     </w:pPr>
     <w:rPr>
+      <w:rFonts w:ascii="Arial" w:hAnsi="Arial" w:eastAsia="Arial"/>
       <w:color w:val="FFFFFF" w:themeColor="background1"/>
+      <w:sz w:val="24"/>
     </w:rPr>
     <w:tblPr>
       <w:tblStyleRowBandSize w:val="1"/>
@@ -11779,7 +10970,9 @@
       <w:spacing w:after="0" w:line="240" w:lineRule="auto"/>
     </w:pPr>
     <w:rPr>
+      <w:rFonts w:ascii="Arial" w:hAnsi="Arial" w:eastAsia="Arial"/>
       <w:color w:val="FFFFFF" w:themeColor="background1"/>
+      <w:sz w:val="24"/>
     </w:rPr>
     <w:tblPr>
       <w:tblStyleRowBandSize w:val="1"/>
@@ -11893,7 +11086,9 @@
       <w:spacing w:after="0" w:line="240" w:lineRule="auto"/>
     </w:pPr>
     <w:rPr>
+      <w:rFonts w:ascii="Arial" w:hAnsi="Arial" w:eastAsia="Arial"/>
       <w:color w:val="000000" w:themeColor="text1"/>
+      <w:sz w:val="24"/>
     </w:rPr>
     <w:tblPr>
       <w:tblStyleRowBandSize w:val="1"/>
@@ -12015,7 +11210,9 @@
       <w:spacing w:after="0" w:line="240" w:lineRule="auto"/>
     </w:pPr>
     <w:rPr>
+      <w:rFonts w:ascii="Arial" w:hAnsi="Arial" w:eastAsia="Arial"/>
       <w:color w:val="000000" w:themeColor="text1"/>
+      <w:sz w:val="24"/>
     </w:rPr>
     <w:tblPr>
       <w:tblStyleRowBandSize w:val="1"/>
@@ -12137,7 +11334,9 @@
       <w:spacing w:after="0" w:line="240" w:lineRule="auto"/>
     </w:pPr>
     <w:rPr>
+      <w:rFonts w:ascii="Arial" w:hAnsi="Arial" w:eastAsia="Arial"/>
       <w:color w:val="000000" w:themeColor="text1"/>
+      <w:sz w:val="24"/>
     </w:rPr>
     <w:tblPr>
       <w:tblStyleRowBandSize w:val="1"/>
@@ -12259,7 +11458,9 @@
       <w:spacing w:after="0" w:line="240" w:lineRule="auto"/>
     </w:pPr>
     <w:rPr>
+      <w:rFonts w:ascii="Arial" w:hAnsi="Arial" w:eastAsia="Arial"/>
       <w:color w:val="000000" w:themeColor="text1"/>
+      <w:sz w:val="24"/>
     </w:rPr>
     <w:tblPr>
       <w:tblStyleRowBandSize w:val="1"/>
@@ -12371,7 +11572,9 @@
       <w:spacing w:after="0" w:line="240" w:lineRule="auto"/>
     </w:pPr>
     <w:rPr>
+      <w:rFonts w:ascii="Arial" w:hAnsi="Arial" w:eastAsia="Arial"/>
       <w:color w:val="000000" w:themeColor="text1"/>
+      <w:sz w:val="24"/>
     </w:rPr>
     <w:tblPr>
       <w:tblStyleRowBandSize w:val="1"/>
@@ -12493,7 +11696,9 @@
       <w:spacing w:after="0" w:line="240" w:lineRule="auto"/>
     </w:pPr>
     <w:rPr>
+      <w:rFonts w:ascii="Arial" w:hAnsi="Arial" w:eastAsia="Arial"/>
       <w:color w:val="000000" w:themeColor="text1"/>
+      <w:sz w:val="24"/>
     </w:rPr>
     <w:tblPr>
       <w:tblStyleRowBandSize w:val="1"/>
@@ -12615,7 +11820,9 @@
       <w:spacing w:after="0" w:line="240" w:lineRule="auto"/>
     </w:pPr>
     <w:rPr>
+      <w:rFonts w:ascii="Arial" w:hAnsi="Arial" w:eastAsia="Arial"/>
       <w:color w:val="000000" w:themeColor="text1"/>
+      <w:sz w:val="24"/>
     </w:rPr>
     <w:tblPr>
       <w:tblStyleRowBandSize w:val="1"/>
@@ -12737,7 +11944,9 @@
       <w:spacing w:after="0" w:line="240" w:lineRule="auto"/>
     </w:pPr>
     <w:rPr>
+      <w:rFonts w:ascii="Arial" w:hAnsi="Arial" w:eastAsia="Arial"/>
       <w:color w:val="000000" w:themeColor="text1"/>
+      <w:sz w:val="24"/>
     </w:rPr>
     <w:tblPr>
       <w:tblStyleRowBandSize w:val="1"/>
@@ -12823,7 +12032,9 @@
       <w:spacing w:after="0" w:line="240" w:lineRule="auto"/>
     </w:pPr>
     <w:rPr>
+      <w:rFonts w:ascii="Arial" w:hAnsi="Arial" w:eastAsia="Arial"/>
       <w:color w:val="000000" w:themeColor="text1"/>
+      <w:sz w:val="24"/>
     </w:rPr>
     <w:tblPr>
       <w:tblStyleRowBandSize w:val="1"/>
@@ -12909,7 +12120,9 @@
       <w:spacing w:after="0" w:line="240" w:lineRule="auto"/>
     </w:pPr>
     <w:rPr>
+      <w:rFonts w:ascii="Arial" w:hAnsi="Arial" w:eastAsia="Arial"/>
       <w:color w:val="000000" w:themeColor="text1"/>
+      <w:sz w:val="24"/>
     </w:rPr>
     <w:tblPr>
       <w:tblStyleRowBandSize w:val="1"/>
@@ -12995,7 +12208,9 @@
       <w:spacing w:after="0" w:line="240" w:lineRule="auto"/>
     </w:pPr>
     <w:rPr>
+      <w:rFonts w:ascii="Arial" w:hAnsi="Arial" w:eastAsia="Arial"/>
       <w:color w:val="000000" w:themeColor="text1"/>
+      <w:sz w:val="24"/>
     </w:rPr>
     <w:tblPr>
       <w:tblStyleRowBandSize w:val="1"/>
@@ -13081,7 +12296,9 @@
       <w:spacing w:after="0" w:line="240" w:lineRule="auto"/>
     </w:pPr>
     <w:rPr>
+      <w:rFonts w:ascii="Arial" w:hAnsi="Arial" w:eastAsia="Arial"/>
       <w:color w:val="000000" w:themeColor="text1"/>
+      <w:sz w:val="24"/>
     </w:rPr>
     <w:tblPr>
       <w:tblStyleRowBandSize w:val="1"/>
@@ -13167,7 +12384,9 @@
       <w:spacing w:after="0" w:line="240" w:lineRule="auto"/>
     </w:pPr>
     <w:rPr>
+      <w:rFonts w:ascii="Arial" w:hAnsi="Arial" w:eastAsia="Arial"/>
       <w:color w:val="000000" w:themeColor="text1"/>
+      <w:sz w:val="24"/>
     </w:rPr>
     <w:tblPr>
       <w:tblStyleRowBandSize w:val="1"/>
@@ -13253,7 +12472,9 @@
       <w:spacing w:after="0" w:line="240" w:lineRule="auto"/>
     </w:pPr>
     <w:rPr>
+      <w:rFonts w:ascii="Arial" w:hAnsi="Arial" w:eastAsia="Arial"/>
       <w:color w:val="000000" w:themeColor="text1"/>
+      <w:sz w:val="24"/>
     </w:rPr>
     <w:tblPr>
       <w:tblStyleRowBandSize w:val="1"/>
@@ -13339,7 +12560,9 @@
       <w:spacing w:after="0" w:line="240" w:lineRule="auto"/>
     </w:pPr>
     <w:rPr>
+      <w:rFonts w:ascii="Arial" w:hAnsi="Arial" w:eastAsia="Arial"/>
       <w:color w:val="000000" w:themeColor="text1"/>
+      <w:sz w:val="24"/>
     </w:rPr>
     <w:tblPr>
       <w:tblStyleRowBandSize w:val="1"/>
@@ -13419,7 +12642,9 @@
       <w:spacing w:after="0" w:line="240" w:lineRule="auto"/>
     </w:pPr>
     <w:rPr>
+      <w:rFonts w:ascii="Arial" w:hAnsi="Arial" w:eastAsia="Arial"/>
       <w:color w:val="000000" w:themeColor="text1"/>
+      <w:sz w:val="24"/>
     </w:rPr>
     <w:tblPr>
       <w:tblStyleRowBandSize w:val="1"/>
@@ -13499,7 +12724,9 @@
       <w:spacing w:after="0" w:line="240" w:lineRule="auto"/>
     </w:pPr>
     <w:rPr>
+      <w:rFonts w:ascii="Arial" w:hAnsi="Arial" w:eastAsia="Arial"/>
       <w:color w:val="000000" w:themeColor="text1"/>
+      <w:sz w:val="24"/>
     </w:rPr>
     <w:tblPr>
       <w:tblStyleRowBandSize w:val="1"/>
@@ -13579,7 +12806,9 @@
       <w:spacing w:after="0" w:line="240" w:lineRule="auto"/>
     </w:pPr>
     <w:rPr>
+      <w:rFonts w:ascii="Arial" w:hAnsi="Arial" w:eastAsia="Arial"/>
       <w:color w:val="000000" w:themeColor="text1"/>
+      <w:sz w:val="24"/>
     </w:rPr>
     <w:tblPr>
       <w:tblStyleRowBandSize w:val="1"/>
@@ -13659,7 +12888,9 @@
       <w:spacing w:after="0" w:line="240" w:lineRule="auto"/>
     </w:pPr>
     <w:rPr>
+      <w:rFonts w:ascii="Arial" w:hAnsi="Arial" w:eastAsia="Arial"/>
       <w:color w:val="000000" w:themeColor="text1"/>
+      <w:sz w:val="24"/>
     </w:rPr>
     <w:tblPr>
       <w:tblStyleRowBandSize w:val="1"/>
@@ -13739,7 +12970,9 @@
       <w:spacing w:after="0" w:line="240" w:lineRule="auto"/>
     </w:pPr>
     <w:rPr>
+      <w:rFonts w:ascii="Arial" w:hAnsi="Arial" w:eastAsia="Arial"/>
       <w:color w:val="000000" w:themeColor="text1"/>
+      <w:sz w:val="24"/>
     </w:rPr>
     <w:tblPr>
       <w:tblStyleRowBandSize w:val="1"/>
@@ -13819,7 +13052,9 @@
       <w:spacing w:after="0" w:line="240" w:lineRule="auto"/>
     </w:pPr>
     <w:rPr>
+      <w:rFonts w:ascii="Arial" w:hAnsi="Arial" w:eastAsia="Arial"/>
       <w:color w:val="000000" w:themeColor="text1"/>
+      <w:sz w:val="24"/>
     </w:rPr>
     <w:tblPr>
       <w:tblStyleRowBandSize w:val="1"/>
@@ -13890,29 +13125,27 @@
       </w:tcPr>
     </w:tblStylePr>
   </w:style>
-  <w:style w:type="paragraph" w:customStyle="1" w:styleId="Section">
-    <w:name w:val="Section"/>
+  <w:style w:type="paragraph" w:customStyle="1" w:styleId="PlainHeading">
+    <w:name w:val="Plain Heading"/>
     <w:pPr>
       <w:keepNext/>
-      <w:spacing w:before="100" w:after="40"/>
-    </w:pPr>
-    <w:rPr>
-      <w:rFonts w:ascii="Arial" w:hAnsi="Arial"/>
+      <w:spacing w:before="160" w:after="80"/>
+    </w:pPr>
+    <w:rPr>
+      <w:rFonts w:ascii="Arial" w:hAnsi="Arial" w:eastAsia="Arial"/>
       <w:b/>
-      <w:color w:val="1F4E78"/>
-      <w:sz w:val="22"/>
-    </w:rPr>
-  </w:style>
-  <w:style w:type="paragraph" w:customStyle="1" w:styleId="CompactBullet">
-    <w:name w:val="Compact Bullet"/>
-    <w:basedOn w:val="ListBullet"/>
-    <w:pPr>
-      <w:spacing w:after="30" w:line="240" w:lineRule="auto"/>
-      <w:ind w:left="255" w:hanging="142"/>
-    </w:pPr>
-    <w:rPr>
-      <w:rFonts w:ascii="Arial" w:hAnsi="Arial"/>
-      <w:sz w:val="18"/>
+      <w:sz w:val="24"/>
+    </w:rPr>
+  </w:style>
+  <w:style w:type="paragraph" w:customStyle="1" w:styleId="PlainBullet">
+    <w:name w:val="Plain Bullet"/>
+    <w:pPr>
+      <w:spacing w:after="60" w:line="240" w:lineRule="auto"/>
+      <w:ind w:left="397" w:hanging="227"/>
+    </w:pPr>
+    <w:rPr>
+      <w:rFonts w:ascii="Arial" w:hAnsi="Arial" w:eastAsia="Arial"/>
+      <w:sz w:val="24"/>
     </w:rPr>
   </w:style>
 </w:styles>

</xml_diff>